<commit_message>
Task 1 - Update : Task Report
</commit_message>
<xml_diff>
--- a/Week1/Week 1 Task Report.docx
+++ b/Week1/Week 1 Task Report.docx
@@ -212,39 +212,43 @@
     <w:p>
       <w:pPr>
         <w:numPr>
-          <w:numId w:val="0"/>
-        </w:numPr>
-        <w:rPr>
-          <w:rFonts w:hint="eastAsia" w:eastAsia="Malgun Gothic"/>
-          <w:lang w:val="en-US" w:eastAsia="ko-KR"/>
-        </w:rPr>
-      </w:pPr>
-    </w:p>
-    <w:p>
-      <w:pPr>
-        <w:numPr>
-          <w:numId w:val="0"/>
-        </w:numPr>
-        <w:rPr>
-          <w:rFonts w:hint="default" w:eastAsia="Malgun Gothic"/>
-          <w:lang w:val="en-US" w:eastAsia="ko-KR"/>
-        </w:rPr>
-      </w:pPr>
-    </w:p>
-    <w:p>
-      <w:pPr>
-        <w:numPr>
-          <w:numId w:val="0"/>
-        </w:numPr>
-        <w:rPr>
-          <w:rFonts w:hint="default" w:eastAsia="Malgun Gothic"/>
-          <w:lang w:val="en-US" w:eastAsia="ko-KR"/>
-        </w:rPr>
-      </w:pPr>
-    </w:p>
-    <w:p>
-      <w:pPr>
-        <w:numPr>
+          <w:ilvl w:val="0"/>
+          <w:numId w:val="0"/>
+        </w:numPr>
+        <w:rPr>
+          <w:rFonts w:hint="eastAsia" w:eastAsia="Malgun Gothic"/>
+          <w:lang w:val="en-US" w:eastAsia="ko-KR"/>
+        </w:rPr>
+      </w:pPr>
+    </w:p>
+    <w:p>
+      <w:pPr>
+        <w:numPr>
+          <w:ilvl w:val="0"/>
+          <w:numId w:val="0"/>
+        </w:numPr>
+        <w:rPr>
+          <w:rFonts w:hint="default" w:eastAsia="Malgun Gothic"/>
+          <w:lang w:val="en-US" w:eastAsia="ko-KR"/>
+        </w:rPr>
+      </w:pPr>
+    </w:p>
+    <w:p>
+      <w:pPr>
+        <w:numPr>
+          <w:ilvl w:val="0"/>
+          <w:numId w:val="0"/>
+        </w:numPr>
+        <w:rPr>
+          <w:rFonts w:hint="default" w:eastAsia="Malgun Gothic"/>
+          <w:lang w:val="en-US" w:eastAsia="ko-KR"/>
+        </w:rPr>
+      </w:pPr>
+    </w:p>
+    <w:p>
+      <w:pPr>
+        <w:numPr>
+          <w:ilvl w:val="0"/>
           <w:numId w:val="0"/>
         </w:numPr>
         <w:rPr>
@@ -282,17 +286,19 @@
     <w:p>
       <w:pPr>
         <w:numPr>
-          <w:numId w:val="0"/>
-        </w:numPr>
-        <w:rPr>
-          <w:rFonts w:hint="eastAsia" w:eastAsia="Malgun Gothic"/>
-          <w:lang w:val="en-US" w:eastAsia="ko-KR"/>
-        </w:rPr>
-      </w:pPr>
-    </w:p>
-    <w:p>
-      <w:pPr>
-        <w:numPr>
+          <w:ilvl w:val="0"/>
+          <w:numId w:val="0"/>
+        </w:numPr>
+        <w:rPr>
+          <w:rFonts w:hint="eastAsia" w:eastAsia="Malgun Gothic"/>
+          <w:lang w:val="en-US" w:eastAsia="ko-KR"/>
+        </w:rPr>
+      </w:pPr>
+    </w:p>
+    <w:p>
+      <w:pPr>
+        <w:numPr>
+          <w:ilvl w:val="0"/>
           <w:numId w:val="0"/>
         </w:numPr>
         <w:rPr>
@@ -315,28 +321,31 @@
     <w:p>
       <w:pPr>
         <w:numPr>
-          <w:numId w:val="0"/>
-        </w:numPr>
-        <w:rPr>
-          <w:rFonts w:hint="eastAsia" w:eastAsia="Malgun Gothic"/>
-          <w:lang w:val="en-US" w:eastAsia="ko-KR"/>
-        </w:rPr>
-      </w:pPr>
-    </w:p>
-    <w:p>
-      <w:pPr>
-        <w:numPr>
-          <w:numId w:val="0"/>
-        </w:numPr>
-        <w:rPr>
-          <w:rFonts w:hint="default" w:eastAsia="Malgun Gothic"/>
-          <w:lang w:val="en-US" w:eastAsia="ko-KR"/>
-        </w:rPr>
-      </w:pPr>
-    </w:p>
-    <w:p>
-      <w:pPr>
-        <w:numPr>
+          <w:ilvl w:val="0"/>
+          <w:numId w:val="0"/>
+        </w:numPr>
+        <w:rPr>
+          <w:rFonts w:hint="eastAsia" w:eastAsia="Malgun Gothic"/>
+          <w:lang w:val="en-US" w:eastAsia="ko-KR"/>
+        </w:rPr>
+      </w:pPr>
+    </w:p>
+    <w:p>
+      <w:pPr>
+        <w:numPr>
+          <w:ilvl w:val="0"/>
+          <w:numId w:val="0"/>
+        </w:numPr>
+        <w:rPr>
+          <w:rFonts w:hint="default" w:eastAsia="Malgun Gothic"/>
+          <w:lang w:val="en-US" w:eastAsia="ko-KR"/>
+        </w:rPr>
+      </w:pPr>
+    </w:p>
+    <w:p>
+      <w:pPr>
+        <w:numPr>
+          <w:ilvl w:val="0"/>
           <w:numId w:val="0"/>
         </w:numPr>
         <w:rPr>
@@ -391,6 +400,7 @@
     <w:p>
       <w:pPr>
         <w:numPr>
+          <w:ilvl w:val="0"/>
           <w:numId w:val="0"/>
         </w:numPr>
         <w:rPr>
@@ -445,28 +455,31 @@
     <w:p>
       <w:pPr>
         <w:numPr>
-          <w:numId w:val="0"/>
-        </w:numPr>
-        <w:rPr>
-          <w:rFonts w:hint="eastAsia" w:eastAsia="Malgun Gothic"/>
-          <w:lang w:val="en-US" w:eastAsia="ko-KR"/>
-        </w:rPr>
-      </w:pPr>
-    </w:p>
-    <w:p>
-      <w:pPr>
-        <w:numPr>
-          <w:numId w:val="0"/>
-        </w:numPr>
-        <w:rPr>
-          <w:rFonts w:hint="eastAsia" w:eastAsia="Malgun Gothic"/>
-          <w:lang w:val="en-US" w:eastAsia="ko-KR"/>
-        </w:rPr>
-      </w:pPr>
-    </w:p>
-    <w:p>
-      <w:pPr>
-        <w:numPr>
+          <w:ilvl w:val="0"/>
+          <w:numId w:val="0"/>
+        </w:numPr>
+        <w:rPr>
+          <w:rFonts w:hint="eastAsia" w:eastAsia="Malgun Gothic"/>
+          <w:lang w:val="en-US" w:eastAsia="ko-KR"/>
+        </w:rPr>
+      </w:pPr>
+    </w:p>
+    <w:p>
+      <w:pPr>
+        <w:numPr>
+          <w:ilvl w:val="0"/>
+          <w:numId w:val="0"/>
+        </w:numPr>
+        <w:rPr>
+          <w:rFonts w:hint="eastAsia" w:eastAsia="Malgun Gothic"/>
+          <w:lang w:val="en-US" w:eastAsia="ko-KR"/>
+        </w:rPr>
+      </w:pPr>
+    </w:p>
+    <w:p>
+      <w:pPr>
+        <w:numPr>
+          <w:ilvl w:val="0"/>
           <w:numId w:val="0"/>
         </w:numPr>
         <w:rPr>
@@ -480,14 +493,11 @@
     <w:p>
       <w:pPr>
         <w:numPr>
-          <w:numId w:val="0"/>
-        </w:numPr>
-        <w:rPr>
-          <w:rFonts w:hint="default" w:eastAsia="Malgun Gothic"/>
-          <w:b/>
-          <w:bCs/>
-          <w:sz w:val="28"/>
-          <w:szCs w:val="28"/>
+          <w:ilvl w:val="0"/>
+          <w:numId w:val="0"/>
+        </w:numPr>
+        <w:rPr>
+          <w:rFonts w:hint="default" w:eastAsia="Malgun Gothic"/>
           <w:lang w:val="en-US" w:eastAsia="ko-KR"/>
         </w:rPr>
       </w:pPr>
@@ -506,17 +516,7 @@
     <w:p>
       <w:pPr>
         <w:numPr>
-          <w:numId w:val="0"/>
-        </w:numPr>
-        <w:rPr>
-          <w:rFonts w:hint="default" w:eastAsia="Malgun Gothic"/>
-          <w:lang w:val="en-US" w:eastAsia="ko-KR"/>
-        </w:rPr>
-      </w:pPr>
-    </w:p>
-    <w:p>
-      <w:pPr>
-        <w:numPr>
+          <w:ilvl w:val="0"/>
           <w:numId w:val="0"/>
         </w:numPr>
         <w:rPr>
@@ -555,17 +555,19 @@
     <w:p>
       <w:pPr>
         <w:numPr>
-          <w:numId w:val="0"/>
-        </w:numPr>
-        <w:rPr>
-          <w:rFonts w:hint="eastAsia" w:eastAsia="Malgun Gothic"/>
-          <w:lang w:val="en-US" w:eastAsia="ko-KR"/>
-        </w:rPr>
-      </w:pPr>
-    </w:p>
-    <w:p>
-      <w:pPr>
-        <w:numPr>
+          <w:ilvl w:val="0"/>
+          <w:numId w:val="0"/>
+        </w:numPr>
+        <w:rPr>
+          <w:rFonts w:hint="eastAsia" w:eastAsia="Malgun Gothic"/>
+          <w:lang w:val="en-US" w:eastAsia="ko-KR"/>
+        </w:rPr>
+      </w:pPr>
+    </w:p>
+    <w:p>
+      <w:pPr>
+        <w:numPr>
+          <w:ilvl w:val="0"/>
           <w:numId w:val="0"/>
         </w:numPr>
         <w:rPr>
@@ -588,6 +590,7 @@
     <w:p>
       <w:pPr>
         <w:numPr>
+          <w:ilvl w:val="0"/>
           <w:numId w:val="0"/>
         </w:numPr>
         <w:rPr>
@@ -610,19 +613,21 @@
     <w:p>
       <w:pPr>
         <w:numPr>
-          <w:numId w:val="0"/>
-        </w:numPr>
-        <w:rPr>
-          <w:rFonts w:hint="eastAsia" w:ascii="等线" w:hAnsi="等线" w:eastAsia="等线" w:cs="等线"/>
-          <w:sz w:val="21"/>
-          <w:szCs w:val="21"/>
-          <w:lang w:val="en-US" w:eastAsia="zh-CN"/>
-        </w:rPr>
-      </w:pPr>
-    </w:p>
-    <w:p>
-      <w:pPr>
-        <w:numPr>
+          <w:ilvl w:val="0"/>
+          <w:numId w:val="0"/>
+        </w:numPr>
+        <w:rPr>
+          <w:rFonts w:hint="eastAsia" w:ascii="等线" w:hAnsi="等线" w:eastAsia="等线" w:cs="等线"/>
+          <w:sz w:val="21"/>
+          <w:szCs w:val="21"/>
+          <w:lang w:val="en-US" w:eastAsia="zh-CN"/>
+        </w:rPr>
+      </w:pPr>
+    </w:p>
+    <w:p>
+      <w:pPr>
+        <w:numPr>
+          <w:ilvl w:val="0"/>
           <w:numId w:val="0"/>
         </w:numPr>
         <w:rPr>
@@ -645,19 +650,21 @@
     <w:p>
       <w:pPr>
         <w:numPr>
-          <w:numId w:val="0"/>
-        </w:numPr>
-        <w:rPr>
-          <w:rFonts w:hint="eastAsia" w:ascii="等线" w:hAnsi="等线" w:eastAsia="等线" w:cs="等线"/>
-          <w:sz w:val="21"/>
-          <w:szCs w:val="21"/>
-          <w:lang w:val="en-US" w:eastAsia="zh-CN"/>
-        </w:rPr>
-      </w:pPr>
-    </w:p>
-    <w:p>
-      <w:pPr>
-        <w:numPr>
+          <w:ilvl w:val="0"/>
+          <w:numId w:val="0"/>
+        </w:numPr>
+        <w:rPr>
+          <w:rFonts w:hint="eastAsia" w:ascii="等线" w:hAnsi="等线" w:eastAsia="等线" w:cs="等线"/>
+          <w:sz w:val="21"/>
+          <w:szCs w:val="21"/>
+          <w:lang w:val="en-US" w:eastAsia="zh-CN"/>
+        </w:rPr>
+      </w:pPr>
+    </w:p>
+    <w:p>
+      <w:pPr>
+        <w:numPr>
+          <w:ilvl w:val="0"/>
           <w:numId w:val="0"/>
         </w:numPr>
         <w:rPr>
@@ -680,116 +687,213 @@
     <w:p>
       <w:pPr>
         <w:numPr>
-          <w:numId w:val="0"/>
-        </w:numPr>
-        <w:rPr>
-          <w:rFonts w:hint="eastAsia" w:eastAsia="Malgun Gothic"/>
-          <w:lang w:val="en-US" w:eastAsia="ko-KR"/>
-        </w:rPr>
-      </w:pPr>
-    </w:p>
-    <w:p>
-      <w:pPr>
-        <w:numPr>
-          <w:numId w:val="0"/>
-        </w:numPr>
-        <w:rPr>
-          <w:rFonts w:hint="default" w:eastAsia="Malgun Gothic"/>
-          <w:lang w:val="en-US" w:eastAsia="ko-KR"/>
-        </w:rPr>
-      </w:pPr>
-    </w:p>
-    <w:p>
-      <w:pPr>
-        <w:numPr>
-          <w:numId w:val="0"/>
-        </w:numPr>
-        <w:rPr>
-          <w:rFonts w:hint="default" w:eastAsia="Malgun Gothic"/>
-          <w:lang w:val="en-US" w:eastAsia="ko-KR"/>
-        </w:rPr>
-      </w:pPr>
-    </w:p>
-    <w:p>
-      <w:pPr>
-        <w:numPr>
-          <w:numId w:val="0"/>
-        </w:numPr>
-        <w:rPr>
-          <w:rFonts w:hint="default" w:eastAsia="Malgun Gothic"/>
-          <w:lang w:val="en-US" w:eastAsia="ko-KR"/>
-        </w:rPr>
-      </w:pPr>
-    </w:p>
-    <w:p>
-      <w:pPr>
-        <w:numPr>
-          <w:numId w:val="0"/>
-        </w:numPr>
-        <w:rPr>
-          <w:rFonts w:hint="default" w:eastAsia="Malgun Gothic"/>
-          <w:lang w:val="en-US" w:eastAsia="ko-KR"/>
-        </w:rPr>
-      </w:pPr>
-    </w:p>
-    <w:p>
-      <w:pPr>
-        <w:numPr>
-          <w:numId w:val="0"/>
-        </w:numPr>
-        <w:rPr>
-          <w:rFonts w:hint="default" w:eastAsia="Malgun Gothic"/>
-          <w:lang w:val="en-US" w:eastAsia="ko-KR"/>
-        </w:rPr>
-      </w:pPr>
-    </w:p>
-    <w:p>
-      <w:pPr>
-        <w:numPr>
-          <w:numId w:val="0"/>
-        </w:numPr>
-        <w:rPr>
-          <w:rFonts w:hint="default" w:eastAsia="Malgun Gothic"/>
-          <w:lang w:val="en-US" w:eastAsia="ko-KR"/>
-        </w:rPr>
-      </w:pPr>
-    </w:p>
-    <w:p>
-      <w:pPr>
-        <w:numPr>
-          <w:numId w:val="0"/>
-        </w:numPr>
-        <w:rPr>
-          <w:rFonts w:hint="default" w:eastAsia="Malgun Gothic"/>
-          <w:lang w:val="en-US" w:eastAsia="ko-KR"/>
-        </w:rPr>
-      </w:pPr>
-    </w:p>
-    <w:p>
-      <w:pPr>
-        <w:numPr>
-          <w:numId w:val="0"/>
-        </w:numPr>
-        <w:rPr>
-          <w:rFonts w:hint="default" w:eastAsia="Malgun Gothic"/>
-          <w:lang w:val="en-US" w:eastAsia="ko-KR"/>
-        </w:rPr>
-      </w:pPr>
-    </w:p>
-    <w:p>
-      <w:pPr>
-        <w:numPr>
-          <w:numId w:val="0"/>
-        </w:numPr>
-        <w:rPr>
-          <w:rFonts w:hint="default" w:eastAsia="Malgun Gothic"/>
-          <w:lang w:val="en-US" w:eastAsia="ko-KR"/>
-        </w:rPr>
-      </w:pPr>
-    </w:p>
-    <w:p>
-      <w:pPr>
-        <w:numPr>
+          <w:ilvl w:val="0"/>
+          <w:numId w:val="0"/>
+        </w:numPr>
+        <w:rPr>
+          <w:rFonts w:hint="eastAsia" w:eastAsia="Malgun Gothic"/>
+          <w:lang w:val="en-US" w:eastAsia="ko-KR"/>
+        </w:rPr>
+      </w:pPr>
+    </w:p>
+    <w:p>
+      <w:pPr>
+        <w:numPr>
+          <w:ilvl w:val="0"/>
+          <w:numId w:val="0"/>
+        </w:numPr>
+        <w:rPr>
+          <w:rFonts w:hint="default" w:eastAsia="Malgun Gothic"/>
+          <w:lang w:val="en-US" w:eastAsia="ko-KR"/>
+        </w:rPr>
+      </w:pPr>
+    </w:p>
+    <w:p>
+      <w:pPr>
+        <w:numPr>
+          <w:ilvl w:val="0"/>
+          <w:numId w:val="0"/>
+        </w:numPr>
+        <w:rPr>
+          <w:rFonts w:hint="default" w:eastAsia="Malgun Gothic"/>
+          <w:lang w:val="en-US" w:eastAsia="ko-KR"/>
+        </w:rPr>
+      </w:pPr>
+    </w:p>
+    <w:p>
+      <w:pPr>
+        <w:numPr>
+          <w:ilvl w:val="0"/>
+          <w:numId w:val="0"/>
+        </w:numPr>
+        <w:rPr>
+          <w:rFonts w:hint="default" w:eastAsia="Malgun Gothic"/>
+          <w:lang w:val="en-US" w:eastAsia="ko-KR"/>
+        </w:rPr>
+      </w:pPr>
+      <w:r>
+        <w:rPr>
+          <w:rFonts w:hint="default" w:eastAsia="Malgun Gothic"/>
+          <w:lang w:val="en-US" w:eastAsia="ko-KR"/>
+        </w:rPr>
+        <w:drawing>
+          <wp:inline distT="0" distB="0" distL="114300" distR="114300">
+            <wp:extent cx="4880610" cy="2025650"/>
+            <wp:effectExtent l="0" t="0" r="8890" b="6350"/>
+            <wp:docPr id="3" name="Picture 3" descr="1_Raw_Audio_Waveform"/>
+            <wp:cNvGraphicFramePr>
+              <a:graphicFrameLocks xmlns:a="http://schemas.openxmlformats.org/drawingml/2006/main" noChangeAspect="1"/>
+            </wp:cNvGraphicFramePr>
+            <a:graphic xmlns:a="http://schemas.openxmlformats.org/drawingml/2006/main">
+              <a:graphicData uri="http://schemas.openxmlformats.org/drawingml/2006/picture">
+                <pic:pic xmlns:pic="http://schemas.openxmlformats.org/drawingml/2006/picture">
+                  <pic:nvPicPr>
+                    <pic:cNvPr id="3" name="Picture 3" descr="1_Raw_Audio_Waveform"/>
+                    <pic:cNvPicPr>
+                      <a:picLocks noChangeAspect="1"/>
+                    </pic:cNvPicPr>
+                  </pic:nvPicPr>
+                  <pic:blipFill>
+                    <a:blip r:embed="rId6"/>
+                    <a:stretch>
+                      <a:fillRect/>
+                    </a:stretch>
+                  </pic:blipFill>
+                  <pic:spPr>
+                    <a:xfrm>
+                      <a:off x="0" y="0"/>
+                      <a:ext cx="4880610" cy="2025650"/>
+                    </a:xfrm>
+                    <a:prstGeom prst="rect">
+                      <a:avLst/>
+                    </a:prstGeom>
+                  </pic:spPr>
+                </pic:pic>
+              </a:graphicData>
+            </a:graphic>
+          </wp:inline>
+        </w:drawing>
+      </w:r>
+    </w:p>
+    <w:p>
+      <w:pPr>
+        <w:numPr>
+          <w:ilvl w:val="0"/>
+          <w:numId w:val="0"/>
+        </w:numPr>
+        <w:rPr>
+          <w:rFonts w:hint="default" w:eastAsia="Malgun Gothic"/>
+          <w:lang w:val="en-US" w:eastAsia="ko-KR"/>
+        </w:rPr>
+      </w:pPr>
+    </w:p>
+    <w:p>
+      <w:pPr>
+        <w:numPr>
+          <w:ilvl w:val="0"/>
+          <w:numId w:val="0"/>
+        </w:numPr>
+        <w:rPr>
+          <w:rFonts w:hint="default" w:eastAsia="Malgun Gothic"/>
+          <w:lang w:val="en-US" w:eastAsia="ko-KR"/>
+        </w:rPr>
+      </w:pPr>
+      <w:r>
+        <w:rPr>
+          <w:rFonts w:hint="default" w:eastAsia="Malgun Gothic"/>
+          <w:lang w:val="en-US" w:eastAsia="ko-KR"/>
+        </w:rPr>
+        <w:drawing>
+          <wp:inline distT="0" distB="0" distL="114300" distR="114300">
+            <wp:extent cx="5274310" cy="1883410"/>
+            <wp:effectExtent l="0" t="0" r="8890" b="8890"/>
+            <wp:docPr id="5" name="Picture 5" descr="2_Fourier_Transform"/>
+            <wp:cNvGraphicFramePr>
+              <a:graphicFrameLocks xmlns:a="http://schemas.openxmlformats.org/drawingml/2006/main" noChangeAspect="1"/>
+            </wp:cNvGraphicFramePr>
+            <a:graphic xmlns:a="http://schemas.openxmlformats.org/drawingml/2006/main">
+              <a:graphicData uri="http://schemas.openxmlformats.org/drawingml/2006/picture">
+                <pic:pic xmlns:pic="http://schemas.openxmlformats.org/drawingml/2006/picture">
+                  <pic:nvPicPr>
+                    <pic:cNvPr id="5" name="Picture 5" descr="2_Fourier_Transform"/>
+                    <pic:cNvPicPr>
+                      <a:picLocks noChangeAspect="1"/>
+                    </pic:cNvPicPr>
+                  </pic:nvPicPr>
+                  <pic:blipFill>
+                    <a:blip r:embed="rId7"/>
+                    <a:stretch>
+                      <a:fillRect/>
+                    </a:stretch>
+                  </pic:blipFill>
+                  <pic:spPr>
+                    <a:xfrm>
+                      <a:off x="0" y="0"/>
+                      <a:ext cx="5274310" cy="1883410"/>
+                    </a:xfrm>
+                    <a:prstGeom prst="rect">
+                      <a:avLst/>
+                    </a:prstGeom>
+                  </pic:spPr>
+                </pic:pic>
+              </a:graphicData>
+            </a:graphic>
+          </wp:inline>
+        </w:drawing>
+      </w:r>
+    </w:p>
+    <w:p>
+      <w:pPr>
+        <w:numPr>
+          <w:ilvl w:val="0"/>
+          <w:numId w:val="0"/>
+        </w:numPr>
+        <w:rPr>
+          <w:rFonts w:hint="default" w:eastAsia="Malgun Gothic"/>
+          <w:lang w:val="en-US" w:eastAsia="ko-KR"/>
+        </w:rPr>
+      </w:pPr>
+    </w:p>
+    <w:p>
+      <w:pPr>
+        <w:numPr>
+          <w:ilvl w:val="0"/>
+          <w:numId w:val="0"/>
+        </w:numPr>
+        <w:rPr>
+          <w:rFonts w:hint="default" w:eastAsia="Malgun Gothic"/>
+          <w:lang w:val="en-US" w:eastAsia="ko-KR"/>
+        </w:rPr>
+      </w:pPr>
+    </w:p>
+    <w:p>
+      <w:pPr>
+        <w:numPr>
+          <w:ilvl w:val="0"/>
+          <w:numId w:val="0"/>
+        </w:numPr>
+        <w:rPr>
+          <w:rFonts w:hint="default" w:eastAsia="Malgun Gothic"/>
+          <w:lang w:val="en-US" w:eastAsia="ko-KR"/>
+        </w:rPr>
+      </w:pPr>
+    </w:p>
+    <w:p>
+      <w:pPr>
+        <w:numPr>
+          <w:ilvl w:val="0"/>
+          <w:numId w:val="0"/>
+        </w:numPr>
+        <w:rPr>
+          <w:rFonts w:hint="default" w:eastAsia="Malgun Gothic"/>
+          <w:lang w:val="en-US" w:eastAsia="ko-KR"/>
+        </w:rPr>
+      </w:pPr>
+    </w:p>
+    <w:p>
+      <w:pPr>
+        <w:numPr>
+          <w:ilvl w:val="0"/>
           <w:numId w:val="0"/>
         </w:numPr>
         <w:rPr>
@@ -841,17 +945,19 @@
     <w:p>
       <w:pPr>
         <w:numPr>
-          <w:numId w:val="0"/>
-        </w:numPr>
-        <w:rPr>
-          <w:rFonts w:hint="default" w:eastAsia="Malgun Gothic"/>
-          <w:lang w:val="en-US" w:eastAsia="ko-KR"/>
-        </w:rPr>
-      </w:pPr>
-    </w:p>
-    <w:p>
-      <w:pPr>
-        <w:numPr>
+          <w:ilvl w:val="0"/>
+          <w:numId w:val="0"/>
+        </w:numPr>
+        <w:rPr>
+          <w:rFonts w:hint="default" w:eastAsia="Malgun Gothic"/>
+          <w:lang w:val="en-US" w:eastAsia="ko-KR"/>
+        </w:rPr>
+      </w:pPr>
+    </w:p>
+    <w:p>
+      <w:pPr>
+        <w:numPr>
+          <w:ilvl w:val="0"/>
           <w:numId w:val="0"/>
         </w:numPr>
         <w:rPr>
@@ -910,6 +1016,7 @@
     <w:p>
       <w:pPr>
         <w:numPr>
+          <w:ilvl w:val="0"/>
           <w:numId w:val="0"/>
         </w:numPr>
         <w:rPr>
@@ -968,19 +1075,21 @@
     <w:p>
       <w:pPr>
         <w:numPr>
-          <w:numId w:val="0"/>
-        </w:numPr>
-        <w:rPr>
-          <w:rFonts w:hint="eastAsia" w:ascii="等线" w:hAnsi="等线" w:eastAsia="等线" w:cs="等线"/>
-          <w:sz w:val="21"/>
-          <w:szCs w:val="21"/>
-          <w:lang w:val="en-US" w:eastAsia="ko-KR"/>
-        </w:rPr>
-      </w:pPr>
-    </w:p>
-    <w:p>
-      <w:pPr>
-        <w:numPr>
+          <w:ilvl w:val="0"/>
+          <w:numId w:val="0"/>
+        </w:numPr>
+        <w:rPr>
+          <w:rFonts w:hint="eastAsia" w:ascii="等线" w:hAnsi="等线" w:eastAsia="等线" w:cs="等线"/>
+          <w:sz w:val="21"/>
+          <w:szCs w:val="21"/>
+          <w:lang w:val="en-US" w:eastAsia="ko-KR"/>
+        </w:rPr>
+      </w:pPr>
+    </w:p>
+    <w:p>
+      <w:pPr>
+        <w:numPr>
+          <w:ilvl w:val="0"/>
           <w:numId w:val="0"/>
         </w:numPr>
         <w:rPr>
@@ -1021,6 +1130,7 @@
     <w:p>
       <w:pPr>
         <w:numPr>
+          <w:ilvl w:val="0"/>
           <w:numId w:val="0"/>
         </w:numPr>
         <w:rPr>
@@ -1079,19 +1189,21 @@
     <w:p>
       <w:pPr>
         <w:numPr>
-          <w:numId w:val="0"/>
-        </w:numPr>
-        <w:rPr>
-          <w:rFonts w:hint="eastAsia" w:ascii="等线" w:hAnsi="等线" w:eastAsia="等线" w:cs="等线"/>
-          <w:sz w:val="21"/>
-          <w:szCs w:val="21"/>
-          <w:lang w:val="en-US" w:eastAsia="ko-KR"/>
-        </w:rPr>
-      </w:pPr>
-    </w:p>
-    <w:p>
-      <w:pPr>
-        <w:numPr>
+          <w:ilvl w:val="0"/>
+          <w:numId w:val="0"/>
+        </w:numPr>
+        <w:rPr>
+          <w:rFonts w:hint="eastAsia" w:ascii="等线" w:hAnsi="等线" w:eastAsia="等线" w:cs="等线"/>
+          <w:sz w:val="21"/>
+          <w:szCs w:val="21"/>
+          <w:lang w:val="en-US" w:eastAsia="ko-KR"/>
+        </w:rPr>
+      </w:pPr>
+    </w:p>
+    <w:p>
+      <w:pPr>
+        <w:numPr>
+          <w:ilvl w:val="0"/>
           <w:numId w:val="0"/>
         </w:numPr>
         <w:rPr>
@@ -1168,41 +1280,146 @@
     <w:p>
       <w:pPr>
         <w:numPr>
-          <w:numId w:val="0"/>
-        </w:numPr>
-        <w:rPr>
-          <w:rFonts w:hint="default" w:eastAsia="Malgun Gothic"/>
-          <w:lang w:val="en-US" w:eastAsia="ko-KR"/>
-        </w:rPr>
-      </w:pPr>
-    </w:p>
-    <w:p>
-      <w:pPr>
-        <w:numPr>
-          <w:numId w:val="0"/>
-        </w:numPr>
-        <w:rPr>
-          <w:rFonts w:hint="default" w:eastAsia="Malgun Gothic"/>
-          <w:lang w:val="en-US" w:eastAsia="ko-KR"/>
-        </w:rPr>
-      </w:pPr>
-    </w:p>
-    <w:p>
-      <w:pPr>
-        <w:numPr>
-          <w:numId w:val="0"/>
-        </w:numPr>
-        <w:rPr>
-          <w:rFonts w:hint="default" w:eastAsia="Malgun Gothic"/>
-          <w:lang w:val="en-US" w:eastAsia="ko-KR"/>
-        </w:rPr>
-      </w:pPr>
-      <w:bookmarkStart w:id="0" w:name="_GoBack"/>
-      <w:bookmarkEnd w:id="0"/>
-    </w:p>
-    <w:p>
-      <w:pPr>
-        <w:numPr>
+          <w:ilvl w:val="0"/>
+          <w:numId w:val="0"/>
+        </w:numPr>
+        <w:rPr>
+          <w:rFonts w:hint="default" w:eastAsia="Malgun Gothic"/>
+          <w:lang w:val="en-US" w:eastAsia="ko-KR"/>
+        </w:rPr>
+      </w:pPr>
+    </w:p>
+    <w:p>
+      <w:pPr>
+        <w:numPr>
+          <w:ilvl w:val="0"/>
+          <w:numId w:val="0"/>
+        </w:numPr>
+        <w:rPr>
+          <w:rFonts w:hint="default" w:eastAsia="Malgun Gothic"/>
+          <w:lang w:val="en-US" w:eastAsia="ko-KR"/>
+        </w:rPr>
+      </w:pPr>
+    </w:p>
+    <w:p>
+      <w:pPr>
+        <w:numPr>
+          <w:ilvl w:val="0"/>
+          <w:numId w:val="0"/>
+        </w:numPr>
+        <w:rPr>
+          <w:rFonts w:hint="default" w:eastAsia="Malgun Gothic"/>
+          <w:lang w:val="en-US" w:eastAsia="ko-KR"/>
+        </w:rPr>
+      </w:pPr>
+      <w:r>
+        <w:rPr>
+          <w:rFonts w:hint="default" w:eastAsia="Malgun Gothic"/>
+          <w:lang w:val="en-US" w:eastAsia="ko-KR"/>
+        </w:rPr>
+        <w:drawing>
+          <wp:inline distT="0" distB="0" distL="114300" distR="114300">
+            <wp:extent cx="5274310" cy="1883410"/>
+            <wp:effectExtent l="0" t="0" r="8890" b="8890"/>
+            <wp:docPr id="4" name="Picture 4" descr="2_Fourier_Transform"/>
+            <wp:cNvGraphicFramePr>
+              <a:graphicFrameLocks xmlns:a="http://schemas.openxmlformats.org/drawingml/2006/main" noChangeAspect="1"/>
+            </wp:cNvGraphicFramePr>
+            <a:graphic xmlns:a="http://schemas.openxmlformats.org/drawingml/2006/main">
+              <a:graphicData uri="http://schemas.openxmlformats.org/drawingml/2006/picture">
+                <pic:pic xmlns:pic="http://schemas.openxmlformats.org/drawingml/2006/picture">
+                  <pic:nvPicPr>
+                    <pic:cNvPr id="4" name="Picture 4" descr="2_Fourier_Transform"/>
+                    <pic:cNvPicPr>
+                      <a:picLocks noChangeAspect="1"/>
+                    </pic:cNvPicPr>
+                  </pic:nvPicPr>
+                  <pic:blipFill>
+                    <a:blip r:embed="rId7"/>
+                    <a:stretch>
+                      <a:fillRect/>
+                    </a:stretch>
+                  </pic:blipFill>
+                  <pic:spPr>
+                    <a:xfrm>
+                      <a:off x="0" y="0"/>
+                      <a:ext cx="5274310" cy="1883410"/>
+                    </a:xfrm>
+                    <a:prstGeom prst="rect">
+                      <a:avLst/>
+                    </a:prstGeom>
+                  </pic:spPr>
+                </pic:pic>
+              </a:graphicData>
+            </a:graphic>
+          </wp:inline>
+        </w:drawing>
+      </w:r>
+    </w:p>
+    <w:p>
+      <w:pPr>
+        <w:numPr>
+          <w:ilvl w:val="0"/>
+          <w:numId w:val="0"/>
+        </w:numPr>
+        <w:rPr>
+          <w:rFonts w:hint="default" w:eastAsia="Malgun Gothic"/>
+          <w:lang w:val="en-US" w:eastAsia="ko-KR"/>
+        </w:rPr>
+      </w:pPr>
+    </w:p>
+    <w:p>
+      <w:pPr>
+        <w:numPr>
+          <w:ilvl w:val="0"/>
+          <w:numId w:val="0"/>
+        </w:numPr>
+        <w:rPr>
+          <w:rFonts w:hint="default" w:eastAsia="Malgun Gothic"/>
+          <w:lang w:val="en-US" w:eastAsia="ko-KR"/>
+        </w:rPr>
+      </w:pPr>
+    </w:p>
+    <w:p>
+      <w:pPr>
+        <w:numPr>
+          <w:ilvl w:val="0"/>
+          <w:numId w:val="0"/>
+        </w:numPr>
+        <w:rPr>
+          <w:rFonts w:hint="default" w:eastAsia="Malgun Gothic"/>
+          <w:lang w:val="en-US" w:eastAsia="ko-KR"/>
+        </w:rPr>
+      </w:pPr>
+    </w:p>
+    <w:p>
+      <w:pPr>
+        <w:numPr>
+          <w:ilvl w:val="0"/>
+          <w:numId w:val="0"/>
+        </w:numPr>
+        <w:rPr>
+          <w:rFonts w:hint="default" w:eastAsia="Malgun Gothic"/>
+          <w:lang w:val="en-US" w:eastAsia="ko-KR"/>
+        </w:rPr>
+      </w:pPr>
+    </w:p>
+    <w:p>
+      <w:pPr>
+        <w:numPr>
+          <w:ilvl w:val="0"/>
+          <w:numId w:val="0"/>
+        </w:numPr>
+        <w:rPr>
+          <w:rFonts w:hint="default" w:eastAsia="Malgun Gothic"/>
+          <w:lang w:val="en-US" w:eastAsia="ko-KR"/>
+        </w:rPr>
+      </w:pPr>
+    </w:p>
+    <w:p>
+      <w:pPr>
+        <w:numPr>
+          <w:ilvl w:val="0"/>
           <w:numId w:val="0"/>
         </w:numPr>
         <w:rPr>
@@ -1242,17 +1459,19 @@
     <w:p>
       <w:pPr>
         <w:numPr>
-          <w:numId w:val="0"/>
-        </w:numPr>
-        <w:rPr>
-          <w:rFonts w:hint="eastAsia" w:eastAsia="Malgun Gothic"/>
-          <w:lang w:val="en-US" w:eastAsia="ko-KR"/>
-        </w:rPr>
-      </w:pPr>
-    </w:p>
-    <w:p>
-      <w:pPr>
-        <w:numPr>
+          <w:ilvl w:val="0"/>
+          <w:numId w:val="0"/>
+        </w:numPr>
+        <w:rPr>
+          <w:rFonts w:hint="eastAsia" w:eastAsia="Malgun Gothic"/>
+          <w:lang w:val="en-US" w:eastAsia="ko-KR"/>
+        </w:rPr>
+      </w:pPr>
+    </w:p>
+    <w:p>
+      <w:pPr>
+        <w:numPr>
+          <w:ilvl w:val="0"/>
           <w:numId w:val="0"/>
         </w:numPr>
         <w:rPr>
@@ -1311,6 +1530,7 @@
     <w:p>
       <w:pPr>
         <w:numPr>
+          <w:ilvl w:val="0"/>
           <w:numId w:val="0"/>
         </w:numPr>
         <w:rPr>
@@ -1360,19 +1580,21 @@
     <w:p>
       <w:pPr>
         <w:numPr>
-          <w:numId w:val="0"/>
-        </w:numPr>
-        <w:rPr>
-          <w:rFonts w:hint="eastAsia" w:ascii="等线" w:hAnsi="等线" w:eastAsia="等线" w:cs="等线"/>
-          <w:sz w:val="21"/>
-          <w:szCs w:val="21"/>
-          <w:lang w:val="en-US" w:eastAsia="ko-KR"/>
-        </w:rPr>
-      </w:pPr>
-    </w:p>
-    <w:p>
-      <w:pPr>
-        <w:numPr>
+          <w:ilvl w:val="0"/>
+          <w:numId w:val="0"/>
+        </w:numPr>
+        <w:rPr>
+          <w:rFonts w:hint="eastAsia" w:ascii="等线" w:hAnsi="等线" w:eastAsia="等线" w:cs="等线"/>
+          <w:sz w:val="21"/>
+          <w:szCs w:val="21"/>
+          <w:lang w:val="en-US" w:eastAsia="ko-KR"/>
+        </w:rPr>
+      </w:pPr>
+    </w:p>
+    <w:p>
+      <w:pPr>
+        <w:numPr>
+          <w:ilvl w:val="0"/>
           <w:numId w:val="0"/>
         </w:numPr>
         <w:rPr>
@@ -1431,6 +1653,7 @@
     <w:p>
       <w:pPr>
         <w:numPr>
+          <w:ilvl w:val="0"/>
           <w:numId w:val="0"/>
         </w:numPr>
         <w:rPr>
@@ -1471,95 +1694,148 @@
     <w:p>
       <w:pPr>
         <w:numPr>
-          <w:numId w:val="0"/>
-        </w:numPr>
-        <w:rPr>
-          <w:rFonts w:hint="eastAsia" w:eastAsia="Malgun Gothic"/>
-          <w:lang w:val="en-US" w:eastAsia="ko-KR"/>
-        </w:rPr>
-      </w:pPr>
-    </w:p>
-    <w:p>
-      <w:pPr>
-        <w:numPr>
-          <w:numId w:val="0"/>
-        </w:numPr>
-        <w:rPr>
-          <w:rFonts w:hint="eastAsia" w:eastAsia="Malgun Gothic"/>
-          <w:sz w:val="21"/>
-          <w:szCs w:val="21"/>
-          <w:lang w:val="en-US" w:eastAsia="ko-KR"/>
-        </w:rPr>
-      </w:pPr>
-    </w:p>
-    <w:p>
-      <w:pPr>
-        <w:numPr>
-          <w:numId w:val="0"/>
-        </w:numPr>
-        <w:rPr>
-          <w:rFonts w:hint="eastAsia" w:eastAsia="Malgun Gothic"/>
-          <w:sz w:val="21"/>
-          <w:szCs w:val="21"/>
-          <w:lang w:val="en-US" w:eastAsia="ko-KR"/>
-        </w:rPr>
-      </w:pPr>
-    </w:p>
-    <w:p>
-      <w:pPr>
-        <w:numPr>
-          <w:numId w:val="0"/>
-        </w:numPr>
-        <w:rPr>
-          <w:rFonts w:hint="eastAsia" w:eastAsia="Malgun Gothic"/>
-          <w:sz w:val="21"/>
-          <w:szCs w:val="21"/>
-          <w:lang w:val="en-US" w:eastAsia="ko-KR"/>
-        </w:rPr>
-      </w:pPr>
-    </w:p>
-    <w:p>
-      <w:pPr>
-        <w:numPr>
-          <w:numId w:val="0"/>
-        </w:numPr>
-        <w:rPr>
-          <w:rFonts w:hint="eastAsia" w:eastAsia="Malgun Gothic"/>
-          <w:sz w:val="21"/>
-          <w:szCs w:val="21"/>
-          <w:lang w:val="en-US" w:eastAsia="ko-KR"/>
-        </w:rPr>
-      </w:pPr>
-    </w:p>
-    <w:p>
-      <w:pPr>
-        <w:numPr>
-          <w:numId w:val="0"/>
-        </w:numPr>
-        <w:rPr>
-          <w:rFonts w:hint="eastAsia" w:eastAsia="Malgun Gothic"/>
-          <w:sz w:val="21"/>
-          <w:szCs w:val="21"/>
-          <w:lang w:val="en-US" w:eastAsia="ko-KR"/>
-        </w:rPr>
-      </w:pPr>
-    </w:p>
-    <w:p>
-      <w:pPr>
-        <w:numPr>
-          <w:numId w:val="0"/>
-        </w:numPr>
-        <w:rPr>
-          <w:rFonts w:hint="eastAsia" w:eastAsia="Malgun Gothic"/>
-          <w:sz w:val="21"/>
-          <w:szCs w:val="21"/>
-          <w:lang w:val="en-US" w:eastAsia="ko-KR"/>
-        </w:rPr>
-      </w:pPr>
-    </w:p>
-    <w:p>
-      <w:pPr>
-        <w:numPr>
+          <w:ilvl w:val="0"/>
+          <w:numId w:val="0"/>
+        </w:numPr>
+        <w:rPr>
+          <w:rFonts w:hint="eastAsia" w:eastAsia="Malgun Gothic"/>
+          <w:lang w:val="en-US" w:eastAsia="ko-KR"/>
+        </w:rPr>
+      </w:pPr>
+    </w:p>
+    <w:p>
+      <w:pPr>
+        <w:numPr>
+          <w:ilvl w:val="0"/>
+          <w:numId w:val="0"/>
+        </w:numPr>
+        <w:rPr>
+          <w:rFonts w:hint="eastAsia" w:eastAsia="Malgun Gothic"/>
+          <w:sz w:val="21"/>
+          <w:szCs w:val="21"/>
+          <w:lang w:val="en-US" w:eastAsia="ko-KR"/>
+        </w:rPr>
+      </w:pPr>
+    </w:p>
+    <w:p>
+      <w:pPr>
+        <w:numPr>
+          <w:ilvl w:val="0"/>
+          <w:numId w:val="0"/>
+        </w:numPr>
+        <w:rPr>
+          <w:rFonts w:hint="eastAsia" w:eastAsia="Malgun Gothic"/>
+          <w:sz w:val="21"/>
+          <w:szCs w:val="21"/>
+          <w:lang w:val="en-US" w:eastAsia="ko-KR"/>
+        </w:rPr>
+      </w:pPr>
+    </w:p>
+    <w:p>
+      <w:pPr>
+        <w:numPr>
+          <w:ilvl w:val="0"/>
+          <w:numId w:val="0"/>
+        </w:numPr>
+        <w:rPr>
+          <w:rFonts w:hint="eastAsia" w:eastAsia="Malgun Gothic"/>
+          <w:sz w:val="21"/>
+          <w:szCs w:val="21"/>
+          <w:lang w:val="en-US" w:eastAsia="ko-KR"/>
+        </w:rPr>
+      </w:pPr>
+      <w:r>
+        <w:rPr>
+          <w:rFonts w:hint="eastAsia" w:eastAsia="Malgun Gothic"/>
+          <w:sz w:val="21"/>
+          <w:szCs w:val="21"/>
+          <w:lang w:val="en-US" w:eastAsia="ko-KR"/>
+        </w:rPr>
+        <w:drawing>
+          <wp:inline distT="0" distB="0" distL="114300" distR="114300">
+            <wp:extent cx="5274310" cy="1883410"/>
+            <wp:effectExtent l="0" t="0" r="8890" b="8890"/>
+            <wp:docPr id="6" name="Picture 6" descr="4_Short_Time_Fourier_Transform"/>
+            <wp:cNvGraphicFramePr>
+              <a:graphicFrameLocks xmlns:a="http://schemas.openxmlformats.org/drawingml/2006/main" noChangeAspect="1"/>
+            </wp:cNvGraphicFramePr>
+            <a:graphic xmlns:a="http://schemas.openxmlformats.org/drawingml/2006/main">
+              <a:graphicData uri="http://schemas.openxmlformats.org/drawingml/2006/picture">
+                <pic:pic xmlns:pic="http://schemas.openxmlformats.org/drawingml/2006/picture">
+                  <pic:nvPicPr>
+                    <pic:cNvPr id="6" name="Picture 6" descr="4_Short_Time_Fourier_Transform"/>
+                    <pic:cNvPicPr>
+                      <a:picLocks noChangeAspect="1"/>
+                    </pic:cNvPicPr>
+                  </pic:nvPicPr>
+                  <pic:blipFill>
+                    <a:blip r:embed="rId8"/>
+                    <a:stretch>
+                      <a:fillRect/>
+                    </a:stretch>
+                  </pic:blipFill>
+                  <pic:spPr>
+                    <a:xfrm>
+                      <a:off x="0" y="0"/>
+                      <a:ext cx="5274310" cy="1883410"/>
+                    </a:xfrm>
+                    <a:prstGeom prst="rect">
+                      <a:avLst/>
+                    </a:prstGeom>
+                  </pic:spPr>
+                </pic:pic>
+              </a:graphicData>
+            </a:graphic>
+          </wp:inline>
+        </w:drawing>
+      </w:r>
+    </w:p>
+    <w:p>
+      <w:pPr>
+        <w:numPr>
+          <w:ilvl w:val="0"/>
+          <w:numId w:val="0"/>
+        </w:numPr>
+        <w:rPr>
+          <w:rFonts w:hint="eastAsia" w:eastAsia="Malgun Gothic"/>
+          <w:sz w:val="21"/>
+          <w:szCs w:val="21"/>
+          <w:lang w:val="en-US" w:eastAsia="ko-KR"/>
+        </w:rPr>
+      </w:pPr>
+    </w:p>
+    <w:p>
+      <w:pPr>
+        <w:numPr>
+          <w:ilvl w:val="0"/>
+          <w:numId w:val="0"/>
+        </w:numPr>
+        <w:rPr>
+          <w:rFonts w:hint="eastAsia" w:eastAsia="Malgun Gothic"/>
+          <w:sz w:val="21"/>
+          <w:szCs w:val="21"/>
+          <w:lang w:val="en-US" w:eastAsia="ko-KR"/>
+        </w:rPr>
+      </w:pPr>
+    </w:p>
+    <w:p>
+      <w:pPr>
+        <w:numPr>
+          <w:ilvl w:val="0"/>
+          <w:numId w:val="0"/>
+        </w:numPr>
+        <w:rPr>
+          <w:rFonts w:hint="eastAsia" w:eastAsia="Malgun Gothic"/>
+          <w:sz w:val="21"/>
+          <w:szCs w:val="21"/>
+          <w:lang w:val="en-US" w:eastAsia="ko-KR"/>
+        </w:rPr>
+      </w:pPr>
+    </w:p>
+    <w:p>
+      <w:pPr>
+        <w:numPr>
+          <w:ilvl w:val="0"/>
           <w:numId w:val="0"/>
         </w:numPr>
         <w:rPr>
@@ -1582,6 +1858,7 @@
     <w:p>
       <w:pPr>
         <w:numPr>
+          <w:ilvl w:val="0"/>
           <w:numId w:val="0"/>
         </w:numPr>
         <w:rPr>
@@ -1674,19 +1951,21 @@
     <w:p>
       <w:pPr>
         <w:numPr>
-          <w:numId w:val="0"/>
-        </w:numPr>
-        <w:rPr>
-          <w:rFonts w:hint="default" w:eastAsia="Malgun Gothic"/>
-          <w:sz w:val="21"/>
-          <w:szCs w:val="21"/>
-          <w:lang w:val="en-US" w:eastAsia="ko-KR"/>
-        </w:rPr>
-      </w:pPr>
-    </w:p>
-    <w:p>
-      <w:pPr>
-        <w:numPr>
+          <w:ilvl w:val="0"/>
+          <w:numId w:val="0"/>
+        </w:numPr>
+        <w:rPr>
+          <w:rFonts w:hint="default" w:eastAsia="Malgun Gothic"/>
+          <w:sz w:val="21"/>
+          <w:szCs w:val="21"/>
+          <w:lang w:val="en-US" w:eastAsia="ko-KR"/>
+        </w:rPr>
+      </w:pPr>
+    </w:p>
+    <w:p>
+      <w:pPr>
+        <w:numPr>
+          <w:ilvl w:val="0"/>
           <w:numId w:val="0"/>
         </w:numPr>
         <w:rPr>
@@ -1747,19 +2026,21 @@
     <w:p>
       <w:pPr>
         <w:numPr>
-          <w:numId w:val="0"/>
-        </w:numPr>
-        <w:rPr>
-          <w:rFonts w:hint="default" w:eastAsia="Malgun Gothic"/>
-          <w:sz w:val="21"/>
-          <w:szCs w:val="21"/>
-          <w:lang w:val="en-US" w:eastAsia="ko-KR"/>
-        </w:rPr>
-      </w:pPr>
-    </w:p>
-    <w:p>
-      <w:pPr>
-        <w:numPr>
+          <w:ilvl w:val="0"/>
+          <w:numId w:val="0"/>
+        </w:numPr>
+        <w:rPr>
+          <w:rFonts w:hint="default" w:eastAsia="Malgun Gothic"/>
+          <w:sz w:val="21"/>
+          <w:szCs w:val="21"/>
+          <w:lang w:val="en-US" w:eastAsia="ko-KR"/>
+        </w:rPr>
+      </w:pPr>
+    </w:p>
+    <w:p>
+      <w:pPr>
+        <w:numPr>
+          <w:ilvl w:val="0"/>
           <w:numId w:val="0"/>
         </w:numPr>
         <w:rPr>
@@ -1856,50 +2137,55 @@
     <w:p>
       <w:pPr>
         <w:numPr>
-          <w:numId w:val="0"/>
-        </w:numPr>
-        <w:rPr>
-          <w:rFonts w:hint="default" w:eastAsia="Malgun Gothic"/>
-          <w:lang w:val="en-US" w:eastAsia="ko-KR"/>
-        </w:rPr>
-      </w:pPr>
-    </w:p>
-    <w:p>
-      <w:pPr>
-        <w:numPr>
-          <w:numId w:val="0"/>
-        </w:numPr>
-        <w:rPr>
-          <w:rFonts w:hint="default" w:eastAsia="Malgun Gothic"/>
-          <w:lang w:val="en-US" w:eastAsia="ko-KR"/>
-        </w:rPr>
-      </w:pPr>
-    </w:p>
-    <w:p>
-      <w:pPr>
-        <w:numPr>
-          <w:numId w:val="0"/>
-        </w:numPr>
-        <w:rPr>
-          <w:rFonts w:hint="default" w:eastAsia="Malgun Gothic"/>
-          <w:lang w:val="en-US" w:eastAsia="ko-KR"/>
-        </w:rPr>
-      </w:pPr>
-    </w:p>
-    <w:p>
-      <w:pPr>
-        <w:numPr>
-          <w:numId w:val="0"/>
-        </w:numPr>
-        <w:rPr>
-          <w:rFonts w:hint="default" w:eastAsia="Malgun Gothic"/>
-          <w:lang w:val="en-US" w:eastAsia="ko-KR"/>
-        </w:rPr>
-      </w:pPr>
-    </w:p>
-    <w:p>
-      <w:pPr>
-        <w:numPr>
+          <w:ilvl w:val="0"/>
+          <w:numId w:val="0"/>
+        </w:numPr>
+        <w:rPr>
+          <w:rFonts w:hint="default" w:eastAsia="Malgun Gothic"/>
+          <w:lang w:val="en-US" w:eastAsia="ko-KR"/>
+        </w:rPr>
+      </w:pPr>
+    </w:p>
+    <w:p>
+      <w:pPr>
+        <w:numPr>
+          <w:ilvl w:val="0"/>
+          <w:numId w:val="0"/>
+        </w:numPr>
+        <w:rPr>
+          <w:rFonts w:hint="default" w:eastAsia="Malgun Gothic"/>
+          <w:lang w:val="en-US" w:eastAsia="ko-KR"/>
+        </w:rPr>
+      </w:pPr>
+    </w:p>
+    <w:p>
+      <w:pPr>
+        <w:numPr>
+          <w:ilvl w:val="0"/>
+          <w:numId w:val="0"/>
+        </w:numPr>
+        <w:rPr>
+          <w:rFonts w:hint="default" w:eastAsia="Malgun Gothic"/>
+          <w:lang w:val="en-US" w:eastAsia="ko-KR"/>
+        </w:rPr>
+      </w:pPr>
+    </w:p>
+    <w:p>
+      <w:pPr>
+        <w:numPr>
+          <w:ilvl w:val="0"/>
+          <w:numId w:val="0"/>
+        </w:numPr>
+        <w:rPr>
+          <w:rFonts w:hint="default" w:eastAsia="Malgun Gothic"/>
+          <w:lang w:val="en-US" w:eastAsia="ko-KR"/>
+        </w:rPr>
+      </w:pPr>
+    </w:p>
+    <w:p>
+      <w:pPr>
+        <w:numPr>
+          <w:ilvl w:val="0"/>
           <w:numId w:val="0"/>
         </w:numPr>
         <w:rPr>
@@ -1939,17 +2225,19 @@
     <w:p>
       <w:pPr>
         <w:numPr>
-          <w:numId w:val="0"/>
-        </w:numPr>
-        <w:rPr>
-          <w:rFonts w:hint="eastAsia" w:eastAsia="Malgun Gothic"/>
-          <w:lang w:val="en-US" w:eastAsia="ko-KR"/>
-        </w:rPr>
-      </w:pPr>
-    </w:p>
-    <w:p>
-      <w:pPr>
-        <w:numPr>
+          <w:ilvl w:val="0"/>
+          <w:numId w:val="0"/>
+        </w:numPr>
+        <w:rPr>
+          <w:rFonts w:hint="eastAsia" w:eastAsia="Malgun Gothic"/>
+          <w:lang w:val="en-US" w:eastAsia="ko-KR"/>
+        </w:rPr>
+      </w:pPr>
+    </w:p>
+    <w:p>
+      <w:pPr>
+        <w:numPr>
+          <w:ilvl w:val="0"/>
           <w:numId w:val="0"/>
         </w:numPr>
         <w:rPr>
@@ -2008,17 +2296,19 @@
     <w:p>
       <w:pPr>
         <w:numPr>
-          <w:numId w:val="0"/>
-        </w:numPr>
-        <w:rPr>
-          <w:rFonts w:hint="eastAsia" w:eastAsia="Malgun Gothic"/>
-          <w:lang w:val="en-US" w:eastAsia="ko-KR"/>
-        </w:rPr>
-      </w:pPr>
-    </w:p>
-    <w:p>
-      <w:pPr>
-        <w:numPr>
+          <w:ilvl w:val="0"/>
+          <w:numId w:val="0"/>
+        </w:numPr>
+        <w:rPr>
+          <w:rFonts w:hint="eastAsia" w:eastAsia="Malgun Gothic"/>
+          <w:lang w:val="en-US" w:eastAsia="ko-KR"/>
+        </w:rPr>
+      </w:pPr>
+    </w:p>
+    <w:p>
+      <w:pPr>
+        <w:numPr>
+          <w:ilvl w:val="0"/>
           <w:numId w:val="0"/>
         </w:numPr>
         <w:rPr>
@@ -2077,17 +2367,19 @@
     <w:p>
       <w:pPr>
         <w:numPr>
-          <w:numId w:val="0"/>
-        </w:numPr>
-        <w:rPr>
-          <w:rFonts w:hint="eastAsia" w:eastAsia="Malgun Gothic"/>
-          <w:lang w:val="en-US" w:eastAsia="ko-KR"/>
-        </w:rPr>
-      </w:pPr>
-    </w:p>
-    <w:p>
-      <w:pPr>
-        <w:numPr>
+          <w:ilvl w:val="0"/>
+          <w:numId w:val="0"/>
+        </w:numPr>
+        <w:rPr>
+          <w:rFonts w:hint="eastAsia" w:eastAsia="Malgun Gothic"/>
+          <w:lang w:val="en-US" w:eastAsia="ko-KR"/>
+        </w:rPr>
+      </w:pPr>
+    </w:p>
+    <w:p>
+      <w:pPr>
+        <w:numPr>
+          <w:ilvl w:val="0"/>
           <w:numId w:val="0"/>
         </w:numPr>
         <w:rPr>
@@ -2101,58 +2393,108 @@
     <w:p>
       <w:pPr>
         <w:numPr>
-          <w:numId w:val="0"/>
-        </w:numPr>
-        <w:rPr>
-          <w:rFonts w:hint="eastAsia" w:eastAsia="Malgun Gothic"/>
-          <w:sz w:val="21"/>
-          <w:szCs w:val="21"/>
-          <w:lang w:val="en-US" w:eastAsia="ko-KR"/>
-        </w:rPr>
-      </w:pPr>
-    </w:p>
-    <w:p>
-      <w:pPr>
-        <w:numPr>
-          <w:numId w:val="0"/>
-        </w:numPr>
-        <w:rPr>
-          <w:rFonts w:hint="eastAsia" w:eastAsia="Malgun Gothic"/>
-          <w:sz w:val="21"/>
-          <w:szCs w:val="21"/>
-          <w:lang w:val="en-US" w:eastAsia="ko-KR"/>
-        </w:rPr>
-      </w:pPr>
-    </w:p>
-    <w:p>
-      <w:pPr>
-        <w:numPr>
-          <w:numId w:val="0"/>
-        </w:numPr>
-        <w:rPr>
-          <w:rFonts w:hint="eastAsia" w:eastAsia="Malgun Gothic"/>
-          <w:sz w:val="21"/>
-          <w:szCs w:val="21"/>
-          <w:lang w:val="en-US" w:eastAsia="ko-KR"/>
-        </w:rPr>
-      </w:pPr>
-    </w:p>
-    <w:p>
-      <w:pPr>
-        <w:numPr>
-          <w:numId w:val="0"/>
-        </w:numPr>
-        <w:rPr>
-          <w:rFonts w:hint="eastAsia" w:eastAsia="Malgun Gothic"/>
-          <w:sz w:val="21"/>
-          <w:szCs w:val="21"/>
-          <w:lang w:val="en-US" w:eastAsia="ko-KR"/>
-        </w:rPr>
-      </w:pPr>
-    </w:p>
-    <w:p>
-      <w:pPr>
-        <w:numPr>
+          <w:ilvl w:val="0"/>
+          <w:numId w:val="0"/>
+        </w:numPr>
+        <w:rPr>
+          <w:rFonts w:hint="eastAsia" w:eastAsia="Malgun Gothic"/>
+          <w:sz w:val="21"/>
+          <w:szCs w:val="21"/>
+          <w:lang w:val="en-US" w:eastAsia="ko-KR"/>
+        </w:rPr>
+      </w:pPr>
+      <w:r>
+        <w:rPr>
+          <w:rFonts w:hint="eastAsia" w:eastAsia="Malgun Gothic"/>
+          <w:sz w:val="21"/>
+          <w:szCs w:val="21"/>
+          <w:lang w:val="en-US" w:eastAsia="ko-KR"/>
+        </w:rPr>
+        <w:drawing>
+          <wp:inline distT="0" distB="0" distL="114300" distR="114300">
+            <wp:extent cx="5274310" cy="1883410"/>
+            <wp:effectExtent l="0" t="0" r="8890" b="8890"/>
+            <wp:docPr id="7" name="Picture 7" descr="5_Mel_Spectrogram"/>
+            <wp:cNvGraphicFramePr>
+              <a:graphicFrameLocks xmlns:a="http://schemas.openxmlformats.org/drawingml/2006/main" noChangeAspect="1"/>
+            </wp:cNvGraphicFramePr>
+            <a:graphic xmlns:a="http://schemas.openxmlformats.org/drawingml/2006/main">
+              <a:graphicData uri="http://schemas.openxmlformats.org/drawingml/2006/picture">
+                <pic:pic xmlns:pic="http://schemas.openxmlformats.org/drawingml/2006/picture">
+                  <pic:nvPicPr>
+                    <pic:cNvPr id="7" name="Picture 7" descr="5_Mel_Spectrogram"/>
+                    <pic:cNvPicPr>
+                      <a:picLocks noChangeAspect="1"/>
+                    </pic:cNvPicPr>
+                  </pic:nvPicPr>
+                  <pic:blipFill>
+                    <a:blip r:embed="rId9"/>
+                    <a:stretch>
+                      <a:fillRect/>
+                    </a:stretch>
+                  </pic:blipFill>
+                  <pic:spPr>
+                    <a:xfrm>
+                      <a:off x="0" y="0"/>
+                      <a:ext cx="5274310" cy="1883410"/>
+                    </a:xfrm>
+                    <a:prstGeom prst="rect">
+                      <a:avLst/>
+                    </a:prstGeom>
+                  </pic:spPr>
+                </pic:pic>
+              </a:graphicData>
+            </a:graphic>
+          </wp:inline>
+        </w:drawing>
+      </w:r>
+    </w:p>
+    <w:p>
+      <w:pPr>
+        <w:numPr>
+          <w:ilvl w:val="0"/>
+          <w:numId w:val="0"/>
+        </w:numPr>
+        <w:rPr>
+          <w:rFonts w:hint="eastAsia" w:eastAsia="Malgun Gothic"/>
+          <w:sz w:val="21"/>
+          <w:szCs w:val="21"/>
+          <w:lang w:val="en-US" w:eastAsia="ko-KR"/>
+        </w:rPr>
+      </w:pPr>
+    </w:p>
+    <w:p>
+      <w:pPr>
+        <w:numPr>
+          <w:ilvl w:val="0"/>
+          <w:numId w:val="0"/>
+        </w:numPr>
+        <w:rPr>
+          <w:rFonts w:hint="eastAsia" w:eastAsia="Malgun Gothic"/>
+          <w:sz w:val="21"/>
+          <w:szCs w:val="21"/>
+          <w:lang w:val="en-US" w:eastAsia="ko-KR"/>
+        </w:rPr>
+      </w:pPr>
+    </w:p>
+    <w:p>
+      <w:pPr>
+        <w:numPr>
+          <w:ilvl w:val="0"/>
+          <w:numId w:val="0"/>
+        </w:numPr>
+        <w:rPr>
+          <w:rFonts w:hint="eastAsia" w:eastAsia="Malgun Gothic"/>
+          <w:sz w:val="21"/>
+          <w:szCs w:val="21"/>
+          <w:lang w:val="en-US" w:eastAsia="ko-KR"/>
+        </w:rPr>
+      </w:pPr>
+    </w:p>
+    <w:p>
+      <w:pPr>
+        <w:numPr>
+          <w:ilvl w:val="0"/>
           <w:numId w:val="0"/>
         </w:numPr>
         <w:rPr>
@@ -2175,6 +2517,7 @@
     <w:p>
       <w:pPr>
         <w:numPr>
+          <w:ilvl w:val="0"/>
           <w:numId w:val="0"/>
         </w:numPr>
         <w:rPr>
@@ -2235,19 +2578,21 @@
     <w:p>
       <w:pPr>
         <w:numPr>
-          <w:numId w:val="0"/>
-        </w:numPr>
-        <w:rPr>
-          <w:rFonts w:hint="eastAsia" w:eastAsia="Malgun Gothic"/>
-          <w:sz w:val="21"/>
-          <w:szCs w:val="21"/>
-          <w:lang w:val="en-US" w:eastAsia="ko-KR"/>
-        </w:rPr>
-      </w:pPr>
-    </w:p>
-    <w:p>
-      <w:pPr>
-        <w:numPr>
+          <w:ilvl w:val="0"/>
+          <w:numId w:val="0"/>
+        </w:numPr>
+        <w:rPr>
+          <w:rFonts w:hint="eastAsia" w:eastAsia="Malgun Gothic"/>
+          <w:sz w:val="21"/>
+          <w:szCs w:val="21"/>
+          <w:lang w:val="en-US" w:eastAsia="ko-KR"/>
+        </w:rPr>
+      </w:pPr>
+    </w:p>
+    <w:p>
+      <w:pPr>
+        <w:numPr>
+          <w:ilvl w:val="0"/>
           <w:numId w:val="0"/>
         </w:numPr>
         <w:rPr>
@@ -2344,19 +2689,21 @@
     <w:p>
       <w:pPr>
         <w:numPr>
-          <w:numId w:val="0"/>
-        </w:numPr>
-        <w:rPr>
-          <w:rFonts w:hint="default" w:eastAsia="Malgun Gothic"/>
-          <w:sz w:val="21"/>
-          <w:szCs w:val="21"/>
-          <w:lang w:val="en-US" w:eastAsia="ko-KR"/>
-        </w:rPr>
-      </w:pPr>
-    </w:p>
-    <w:p>
-      <w:pPr>
-        <w:numPr>
+          <w:ilvl w:val="0"/>
+          <w:numId w:val="0"/>
+        </w:numPr>
+        <w:rPr>
+          <w:rFonts w:hint="default" w:eastAsia="Malgun Gothic"/>
+          <w:sz w:val="21"/>
+          <w:szCs w:val="21"/>
+          <w:lang w:val="en-US" w:eastAsia="ko-KR"/>
+        </w:rPr>
+      </w:pPr>
+    </w:p>
+    <w:p>
+      <w:pPr>
+        <w:numPr>
+          <w:ilvl w:val="0"/>
           <w:numId w:val="0"/>
         </w:numPr>
         <w:rPr>
@@ -2417,110 +2764,119 @@
     <w:p>
       <w:pPr>
         <w:numPr>
-          <w:numId w:val="0"/>
-        </w:numPr>
-        <w:rPr>
-          <w:rFonts w:hint="default" w:eastAsia="Malgun Gothic"/>
-          <w:sz w:val="21"/>
-          <w:szCs w:val="21"/>
-          <w:lang w:val="en-US" w:eastAsia="ko-KR"/>
-        </w:rPr>
-      </w:pPr>
-    </w:p>
-    <w:p>
-      <w:pPr>
-        <w:numPr>
-          <w:numId w:val="0"/>
-        </w:numPr>
-        <w:rPr>
-          <w:rFonts w:hint="eastAsia" w:eastAsia="Malgun Gothic"/>
-          <w:sz w:val="21"/>
-          <w:szCs w:val="21"/>
-          <w:lang w:val="en-US" w:eastAsia="ko-KR"/>
-        </w:rPr>
-      </w:pPr>
-    </w:p>
-    <w:p>
-      <w:pPr>
-        <w:numPr>
-          <w:numId w:val="0"/>
-        </w:numPr>
-        <w:rPr>
-          <w:rFonts w:hint="eastAsia" w:eastAsia="Malgun Gothic"/>
-          <w:sz w:val="21"/>
-          <w:szCs w:val="21"/>
-          <w:lang w:val="en-US" w:eastAsia="ko-KR"/>
-        </w:rPr>
-      </w:pPr>
-    </w:p>
-    <w:p>
-      <w:pPr>
-        <w:numPr>
-          <w:numId w:val="0"/>
-        </w:numPr>
-        <w:rPr>
-          <w:rFonts w:hint="eastAsia" w:eastAsia="Malgun Gothic"/>
-          <w:sz w:val="21"/>
-          <w:szCs w:val="21"/>
-          <w:lang w:val="en-US" w:eastAsia="ko-KR"/>
-        </w:rPr>
-      </w:pPr>
-    </w:p>
-    <w:p>
-      <w:pPr>
-        <w:numPr>
-          <w:numId w:val="0"/>
-        </w:numPr>
-        <w:rPr>
-          <w:rFonts w:hint="eastAsia" w:eastAsia="Malgun Gothic"/>
-          <w:sz w:val="21"/>
-          <w:szCs w:val="21"/>
-          <w:lang w:val="en-US" w:eastAsia="ko-KR"/>
-        </w:rPr>
-      </w:pPr>
-    </w:p>
-    <w:p>
-      <w:pPr>
-        <w:numPr>
-          <w:numId w:val="0"/>
-        </w:numPr>
-        <w:rPr>
-          <w:rFonts w:hint="eastAsia" w:eastAsia="Malgun Gothic"/>
-          <w:sz w:val="21"/>
-          <w:szCs w:val="21"/>
-          <w:lang w:val="en-US" w:eastAsia="ko-KR"/>
-        </w:rPr>
-      </w:pPr>
-    </w:p>
-    <w:p>
-      <w:pPr>
-        <w:numPr>
-          <w:numId w:val="0"/>
-        </w:numPr>
-        <w:rPr>
-          <w:rFonts w:hint="eastAsia" w:eastAsia="Malgun Gothic"/>
-          <w:sz w:val="21"/>
-          <w:szCs w:val="21"/>
-          <w:lang w:val="en-US" w:eastAsia="ko-KR"/>
-        </w:rPr>
-      </w:pPr>
-    </w:p>
-    <w:p>
-      <w:pPr>
-        <w:numPr>
-          <w:numId w:val="0"/>
-        </w:numPr>
-        <w:rPr>
-          <w:rFonts w:hint="eastAsia" w:eastAsia="Malgun Gothic"/>
-          <w:sz w:val="21"/>
-          <w:szCs w:val="21"/>
-          <w:lang w:val="en-US" w:eastAsia="ko-KR"/>
-        </w:rPr>
-      </w:pPr>
-    </w:p>
-    <w:p>
-      <w:pPr>
-        <w:numPr>
+          <w:ilvl w:val="0"/>
+          <w:numId w:val="0"/>
+        </w:numPr>
+        <w:rPr>
+          <w:rFonts w:hint="default" w:eastAsia="Malgun Gothic"/>
+          <w:sz w:val="21"/>
+          <w:szCs w:val="21"/>
+          <w:lang w:val="en-US" w:eastAsia="ko-KR"/>
+        </w:rPr>
+      </w:pPr>
+    </w:p>
+    <w:p>
+      <w:pPr>
+        <w:numPr>
+          <w:ilvl w:val="0"/>
+          <w:numId w:val="0"/>
+        </w:numPr>
+        <w:rPr>
+          <w:rFonts w:hint="eastAsia" w:eastAsia="Malgun Gothic"/>
+          <w:sz w:val="21"/>
+          <w:szCs w:val="21"/>
+          <w:lang w:val="en-US" w:eastAsia="ko-KR"/>
+        </w:rPr>
+      </w:pPr>
+    </w:p>
+    <w:p>
+      <w:pPr>
+        <w:numPr>
+          <w:ilvl w:val="0"/>
+          <w:numId w:val="0"/>
+        </w:numPr>
+        <w:rPr>
+          <w:rFonts w:hint="eastAsia" w:eastAsia="Malgun Gothic"/>
+          <w:sz w:val="21"/>
+          <w:szCs w:val="21"/>
+          <w:lang w:val="en-US" w:eastAsia="ko-KR"/>
+        </w:rPr>
+      </w:pPr>
+    </w:p>
+    <w:p>
+      <w:pPr>
+        <w:numPr>
+          <w:ilvl w:val="0"/>
+          <w:numId w:val="0"/>
+        </w:numPr>
+        <w:rPr>
+          <w:rFonts w:hint="eastAsia" w:eastAsia="Malgun Gothic"/>
+          <w:sz w:val="21"/>
+          <w:szCs w:val="21"/>
+          <w:lang w:val="en-US" w:eastAsia="ko-KR"/>
+        </w:rPr>
+      </w:pPr>
+    </w:p>
+    <w:p>
+      <w:pPr>
+        <w:numPr>
+          <w:ilvl w:val="0"/>
+          <w:numId w:val="0"/>
+        </w:numPr>
+        <w:rPr>
+          <w:rFonts w:hint="eastAsia" w:eastAsia="Malgun Gothic"/>
+          <w:sz w:val="21"/>
+          <w:szCs w:val="21"/>
+          <w:lang w:val="en-US" w:eastAsia="ko-KR"/>
+        </w:rPr>
+      </w:pPr>
+    </w:p>
+    <w:p>
+      <w:pPr>
+        <w:numPr>
+          <w:ilvl w:val="0"/>
+          <w:numId w:val="0"/>
+        </w:numPr>
+        <w:rPr>
+          <w:rFonts w:hint="eastAsia" w:eastAsia="Malgun Gothic"/>
+          <w:sz w:val="21"/>
+          <w:szCs w:val="21"/>
+          <w:lang w:val="en-US" w:eastAsia="ko-KR"/>
+        </w:rPr>
+      </w:pPr>
+    </w:p>
+    <w:p>
+      <w:pPr>
+        <w:numPr>
+          <w:ilvl w:val="0"/>
+          <w:numId w:val="0"/>
+        </w:numPr>
+        <w:rPr>
+          <w:rFonts w:hint="eastAsia" w:eastAsia="Malgun Gothic"/>
+          <w:sz w:val="21"/>
+          <w:szCs w:val="21"/>
+          <w:lang w:val="en-US" w:eastAsia="ko-KR"/>
+        </w:rPr>
+      </w:pPr>
+    </w:p>
+    <w:p>
+      <w:pPr>
+        <w:numPr>
+          <w:ilvl w:val="0"/>
+          <w:numId w:val="0"/>
+        </w:numPr>
+        <w:rPr>
+          <w:rFonts w:hint="eastAsia" w:eastAsia="Malgun Gothic"/>
+          <w:sz w:val="21"/>
+          <w:szCs w:val="21"/>
+          <w:lang w:val="en-US" w:eastAsia="ko-KR"/>
+        </w:rPr>
+      </w:pPr>
+    </w:p>
+    <w:p>
+      <w:pPr>
+        <w:numPr>
+          <w:ilvl w:val="0"/>
           <w:numId w:val="0"/>
         </w:numPr>
         <w:rPr>
@@ -2562,19 +2918,21 @@
     <w:p>
       <w:pPr>
         <w:numPr>
-          <w:numId w:val="0"/>
-        </w:numPr>
-        <w:rPr>
-          <w:rFonts w:hint="eastAsia" w:eastAsia="Malgun Gothic"/>
-          <w:sz w:val="21"/>
-          <w:szCs w:val="21"/>
-          <w:lang w:val="en-US" w:eastAsia="ko-KR"/>
-        </w:rPr>
-      </w:pPr>
-    </w:p>
-    <w:p>
-      <w:pPr>
-        <w:numPr>
+          <w:ilvl w:val="0"/>
+          <w:numId w:val="0"/>
+        </w:numPr>
+        <w:rPr>
+          <w:rFonts w:hint="eastAsia" w:eastAsia="Malgun Gothic"/>
+          <w:sz w:val="21"/>
+          <w:szCs w:val="21"/>
+          <w:lang w:val="en-US" w:eastAsia="ko-KR"/>
+        </w:rPr>
+      </w:pPr>
+    </w:p>
+    <w:p>
+      <w:pPr>
+        <w:numPr>
+          <w:ilvl w:val="0"/>
           <w:numId w:val="0"/>
         </w:numPr>
         <w:rPr>
@@ -2615,71 +2973,77 @@
     <w:p>
       <w:pPr>
         <w:numPr>
-          <w:numId w:val="0"/>
-        </w:numPr>
-        <w:rPr>
-          <w:rFonts w:hint="eastAsia" w:eastAsia="Malgun Gothic"/>
-          <w:sz w:val="21"/>
-          <w:szCs w:val="21"/>
-          <w:lang w:val="en-US" w:eastAsia="ko-KR"/>
-        </w:rPr>
-      </w:pPr>
-    </w:p>
-    <w:p>
-      <w:pPr>
-        <w:numPr>
-          <w:numId w:val="0"/>
-        </w:numPr>
-        <w:rPr>
-          <w:rFonts w:hint="eastAsia" w:eastAsia="Malgun Gothic"/>
-          <w:sz w:val="21"/>
-          <w:szCs w:val="21"/>
-          <w:lang w:val="en-US" w:eastAsia="ko-KR"/>
-        </w:rPr>
-      </w:pPr>
-    </w:p>
-    <w:p>
-      <w:pPr>
-        <w:numPr>
-          <w:numId w:val="0"/>
-        </w:numPr>
-        <w:rPr>
-          <w:rFonts w:hint="eastAsia" w:eastAsia="Malgun Gothic"/>
-          <w:sz w:val="21"/>
-          <w:szCs w:val="21"/>
-          <w:lang w:val="en-US" w:eastAsia="ko-KR"/>
-        </w:rPr>
-      </w:pPr>
-    </w:p>
-    <w:p>
-      <w:pPr>
-        <w:numPr>
-          <w:numId w:val="0"/>
-        </w:numPr>
-        <w:rPr>
-          <w:rFonts w:hint="eastAsia" w:eastAsia="Malgun Gothic"/>
-          <w:sz w:val="21"/>
-          <w:szCs w:val="21"/>
-          <w:lang w:val="en-US" w:eastAsia="ko-KR"/>
-        </w:rPr>
-      </w:pPr>
-    </w:p>
-    <w:p>
-      <w:pPr>
-        <w:numPr>
-          <w:numId w:val="0"/>
-        </w:numPr>
-        <w:rPr>
-          <w:rFonts w:hint="eastAsia" w:eastAsia="Malgun Gothic"/>
-          <w:sz w:val="21"/>
-          <w:szCs w:val="21"/>
-          <w:lang w:val="en-US" w:eastAsia="ko-KR"/>
-        </w:rPr>
-      </w:pPr>
-    </w:p>
-    <w:p>
-      <w:pPr>
-        <w:numPr>
+          <w:ilvl w:val="0"/>
+          <w:numId w:val="0"/>
+        </w:numPr>
+        <w:rPr>
+          <w:rFonts w:hint="eastAsia" w:eastAsia="Malgun Gothic"/>
+          <w:sz w:val="21"/>
+          <w:szCs w:val="21"/>
+          <w:lang w:val="en-US" w:eastAsia="ko-KR"/>
+        </w:rPr>
+      </w:pPr>
+    </w:p>
+    <w:p>
+      <w:pPr>
+        <w:numPr>
+          <w:ilvl w:val="0"/>
+          <w:numId w:val="0"/>
+        </w:numPr>
+        <w:rPr>
+          <w:rFonts w:hint="eastAsia" w:eastAsia="Malgun Gothic"/>
+          <w:sz w:val="21"/>
+          <w:szCs w:val="21"/>
+          <w:lang w:val="en-US" w:eastAsia="ko-KR"/>
+        </w:rPr>
+      </w:pPr>
+    </w:p>
+    <w:p>
+      <w:pPr>
+        <w:numPr>
+          <w:ilvl w:val="0"/>
+          <w:numId w:val="0"/>
+        </w:numPr>
+        <w:rPr>
+          <w:rFonts w:hint="eastAsia" w:eastAsia="Malgun Gothic"/>
+          <w:sz w:val="21"/>
+          <w:szCs w:val="21"/>
+          <w:lang w:val="en-US" w:eastAsia="ko-KR"/>
+        </w:rPr>
+      </w:pPr>
+    </w:p>
+    <w:p>
+      <w:pPr>
+        <w:numPr>
+          <w:ilvl w:val="0"/>
+          <w:numId w:val="0"/>
+        </w:numPr>
+        <w:rPr>
+          <w:rFonts w:hint="eastAsia" w:eastAsia="Malgun Gothic"/>
+          <w:sz w:val="21"/>
+          <w:szCs w:val="21"/>
+          <w:lang w:val="en-US" w:eastAsia="ko-KR"/>
+        </w:rPr>
+      </w:pPr>
+    </w:p>
+    <w:p>
+      <w:pPr>
+        <w:numPr>
+          <w:ilvl w:val="0"/>
+          <w:numId w:val="0"/>
+        </w:numPr>
+        <w:rPr>
+          <w:rFonts w:hint="eastAsia" w:eastAsia="Malgun Gothic"/>
+          <w:sz w:val="21"/>
+          <w:szCs w:val="21"/>
+          <w:lang w:val="en-US" w:eastAsia="ko-KR"/>
+        </w:rPr>
+      </w:pPr>
+    </w:p>
+    <w:p>
+      <w:pPr>
+        <w:numPr>
+          <w:ilvl w:val="0"/>
           <w:numId w:val="0"/>
         </w:numPr>
         <w:rPr>
@@ -2702,110 +3066,164 @@
     <w:p>
       <w:pPr>
         <w:numPr>
-          <w:numId w:val="0"/>
-        </w:numPr>
-        <w:rPr>
-          <w:rFonts w:hint="eastAsia" w:eastAsia="Malgun Gothic"/>
-          <w:sz w:val="21"/>
-          <w:szCs w:val="21"/>
-          <w:lang w:val="en-US" w:eastAsia="ko-KR"/>
-        </w:rPr>
-      </w:pPr>
-    </w:p>
-    <w:p>
-      <w:pPr>
-        <w:numPr>
-          <w:numId w:val="0"/>
-        </w:numPr>
-        <w:rPr>
-          <w:rFonts w:hint="eastAsia" w:eastAsia="Malgun Gothic"/>
-          <w:sz w:val="21"/>
-          <w:szCs w:val="21"/>
-          <w:lang w:val="en-US" w:eastAsia="ko-KR"/>
-        </w:rPr>
-      </w:pPr>
-    </w:p>
-    <w:p>
-      <w:pPr>
-        <w:numPr>
-          <w:numId w:val="0"/>
-        </w:numPr>
-        <w:rPr>
-          <w:rFonts w:hint="eastAsia" w:eastAsia="Malgun Gothic"/>
-          <w:sz w:val="21"/>
-          <w:szCs w:val="21"/>
-          <w:lang w:val="en-US" w:eastAsia="ko-KR"/>
-        </w:rPr>
-      </w:pPr>
-    </w:p>
-    <w:p>
-      <w:pPr>
-        <w:numPr>
-          <w:numId w:val="0"/>
-        </w:numPr>
-        <w:rPr>
-          <w:rFonts w:hint="eastAsia" w:eastAsia="Malgun Gothic"/>
-          <w:sz w:val="21"/>
-          <w:szCs w:val="21"/>
-          <w:lang w:val="en-US" w:eastAsia="ko-KR"/>
-        </w:rPr>
-      </w:pPr>
-    </w:p>
-    <w:p>
-      <w:pPr>
-        <w:numPr>
-          <w:numId w:val="0"/>
-        </w:numPr>
-        <w:rPr>
-          <w:rFonts w:hint="eastAsia" w:eastAsia="Malgun Gothic"/>
-          <w:sz w:val="21"/>
-          <w:szCs w:val="21"/>
-          <w:lang w:val="en-US" w:eastAsia="ko-KR"/>
-        </w:rPr>
-      </w:pPr>
-    </w:p>
-    <w:p>
-      <w:pPr>
-        <w:numPr>
-          <w:numId w:val="0"/>
-        </w:numPr>
-        <w:rPr>
-          <w:rFonts w:hint="eastAsia" w:eastAsia="Malgun Gothic"/>
-          <w:sz w:val="21"/>
-          <w:szCs w:val="21"/>
-          <w:lang w:val="en-US" w:eastAsia="ko-KR"/>
-        </w:rPr>
-      </w:pPr>
-    </w:p>
-    <w:p>
-      <w:pPr>
-        <w:numPr>
-          <w:numId w:val="0"/>
-        </w:numPr>
-        <w:rPr>
-          <w:rFonts w:hint="eastAsia" w:eastAsia="Malgun Gothic"/>
-          <w:sz w:val="21"/>
-          <w:szCs w:val="21"/>
-          <w:lang w:val="en-US" w:eastAsia="ko-KR"/>
-        </w:rPr>
-      </w:pPr>
-    </w:p>
-    <w:p>
-      <w:pPr>
-        <w:numPr>
-          <w:numId w:val="0"/>
-        </w:numPr>
-        <w:rPr>
-          <w:rFonts w:hint="eastAsia" w:eastAsia="Malgun Gothic"/>
-          <w:sz w:val="21"/>
-          <w:szCs w:val="21"/>
-          <w:lang w:val="en-US" w:eastAsia="ko-KR"/>
-        </w:rPr>
-      </w:pPr>
-    </w:p>
-    <w:p>
-      <w:pPr>
-        <w:numPr>
+          <w:ilvl w:val="0"/>
+          <w:numId w:val="0"/>
+        </w:numPr>
+        <w:rPr>
+          <w:rFonts w:hint="eastAsia" w:eastAsia="Malgun Gothic"/>
+          <w:sz w:val="21"/>
+          <w:szCs w:val="21"/>
+          <w:lang w:val="en-US" w:eastAsia="ko-KR"/>
+        </w:rPr>
+      </w:pPr>
+    </w:p>
+    <w:p>
+      <w:pPr>
+        <w:numPr>
+          <w:ilvl w:val="0"/>
+          <w:numId w:val="0"/>
+        </w:numPr>
+        <w:rPr>
+          <w:rFonts w:hint="eastAsia" w:eastAsia="Malgun Gothic"/>
+          <w:sz w:val="21"/>
+          <w:szCs w:val="21"/>
+          <w:lang w:val="en-US" w:eastAsia="ko-KR"/>
+        </w:rPr>
+      </w:pPr>
+    </w:p>
+    <w:p>
+      <w:pPr>
+        <w:numPr>
+          <w:ilvl w:val="0"/>
+          <w:numId w:val="0"/>
+        </w:numPr>
+        <w:rPr>
+          <w:rFonts w:hint="eastAsia" w:eastAsia="Malgun Gothic"/>
+          <w:sz w:val="21"/>
+          <w:szCs w:val="21"/>
+          <w:lang w:val="en-US" w:eastAsia="ko-KR"/>
+        </w:rPr>
+      </w:pPr>
+      <w:r>
+        <w:rPr>
+          <w:rFonts w:hint="eastAsia" w:eastAsia="Malgun Gothic"/>
+          <w:sz w:val="21"/>
+          <w:szCs w:val="21"/>
+          <w:lang w:val="en-US" w:eastAsia="ko-KR"/>
+        </w:rPr>
+        <w:drawing>
+          <wp:inline distT="0" distB="0" distL="114300" distR="114300">
+            <wp:extent cx="5274310" cy="1883410"/>
+            <wp:effectExtent l="0" t="0" r="8890" b="8890"/>
+            <wp:docPr id="8" name="Picture 8" descr="6_Waveform_Transform"/>
+            <wp:cNvGraphicFramePr>
+              <a:graphicFrameLocks xmlns:a="http://schemas.openxmlformats.org/drawingml/2006/main" noChangeAspect="1"/>
+            </wp:cNvGraphicFramePr>
+            <a:graphic xmlns:a="http://schemas.openxmlformats.org/drawingml/2006/main">
+              <a:graphicData uri="http://schemas.openxmlformats.org/drawingml/2006/picture">
+                <pic:pic xmlns:pic="http://schemas.openxmlformats.org/drawingml/2006/picture">
+                  <pic:nvPicPr>
+                    <pic:cNvPr id="8" name="Picture 8" descr="6_Waveform_Transform"/>
+                    <pic:cNvPicPr>
+                      <a:picLocks noChangeAspect="1"/>
+                    </pic:cNvPicPr>
+                  </pic:nvPicPr>
+                  <pic:blipFill>
+                    <a:blip r:embed="rId10"/>
+                    <a:stretch>
+                      <a:fillRect/>
+                    </a:stretch>
+                  </pic:blipFill>
+                  <pic:spPr>
+                    <a:xfrm>
+                      <a:off x="0" y="0"/>
+                      <a:ext cx="5274310" cy="1883410"/>
+                    </a:xfrm>
+                    <a:prstGeom prst="rect">
+                      <a:avLst/>
+                    </a:prstGeom>
+                  </pic:spPr>
+                </pic:pic>
+              </a:graphicData>
+            </a:graphic>
+          </wp:inline>
+        </w:drawing>
+      </w:r>
+    </w:p>
+    <w:p>
+      <w:pPr>
+        <w:numPr>
+          <w:ilvl w:val="0"/>
+          <w:numId w:val="0"/>
+        </w:numPr>
+        <w:rPr>
+          <w:rFonts w:hint="eastAsia" w:eastAsia="Malgun Gothic"/>
+          <w:sz w:val="21"/>
+          <w:szCs w:val="21"/>
+          <w:lang w:val="en-US" w:eastAsia="ko-KR"/>
+        </w:rPr>
+      </w:pPr>
+    </w:p>
+    <w:p>
+      <w:pPr>
+        <w:numPr>
+          <w:ilvl w:val="0"/>
+          <w:numId w:val="0"/>
+        </w:numPr>
+        <w:rPr>
+          <w:rFonts w:hint="eastAsia" w:eastAsia="Malgun Gothic"/>
+          <w:sz w:val="21"/>
+          <w:szCs w:val="21"/>
+          <w:lang w:val="en-US" w:eastAsia="ko-KR"/>
+        </w:rPr>
+      </w:pPr>
+    </w:p>
+    <w:p>
+      <w:pPr>
+        <w:numPr>
+          <w:ilvl w:val="0"/>
+          <w:numId w:val="0"/>
+        </w:numPr>
+        <w:rPr>
+          <w:rFonts w:hint="eastAsia" w:eastAsia="Malgun Gothic"/>
+          <w:sz w:val="21"/>
+          <w:szCs w:val="21"/>
+          <w:lang w:val="en-US" w:eastAsia="ko-KR"/>
+        </w:rPr>
+      </w:pPr>
+    </w:p>
+    <w:p>
+      <w:pPr>
+        <w:numPr>
+          <w:ilvl w:val="0"/>
+          <w:numId w:val="0"/>
+        </w:numPr>
+        <w:rPr>
+          <w:rFonts w:hint="eastAsia" w:eastAsia="Malgun Gothic"/>
+          <w:sz w:val="21"/>
+          <w:szCs w:val="21"/>
+          <w:lang w:val="en-US" w:eastAsia="ko-KR"/>
+        </w:rPr>
+      </w:pPr>
+    </w:p>
+    <w:p>
+      <w:pPr>
+        <w:numPr>
+          <w:ilvl w:val="0"/>
+          <w:numId w:val="0"/>
+        </w:numPr>
+        <w:rPr>
+          <w:rFonts w:hint="eastAsia" w:eastAsia="Malgun Gothic"/>
+          <w:sz w:val="21"/>
+          <w:szCs w:val="21"/>
+          <w:lang w:val="en-US" w:eastAsia="ko-KR"/>
+        </w:rPr>
+      </w:pPr>
+    </w:p>
+    <w:p>
+      <w:pPr>
+        <w:numPr>
+          <w:ilvl w:val="0"/>
           <w:numId w:val="0"/>
         </w:numPr>
         <w:rPr>
@@ -2847,19 +3265,21 @@
     <w:p>
       <w:pPr>
         <w:numPr>
-          <w:numId w:val="0"/>
-        </w:numPr>
-        <w:rPr>
-          <w:rFonts w:hint="eastAsia" w:eastAsia="Malgun Gothic"/>
-          <w:sz w:val="21"/>
-          <w:szCs w:val="21"/>
-          <w:lang w:val="en-US" w:eastAsia="ko-KR"/>
-        </w:rPr>
-      </w:pPr>
-    </w:p>
-    <w:p>
-      <w:pPr>
-        <w:numPr>
+          <w:ilvl w:val="0"/>
+          <w:numId w:val="0"/>
+        </w:numPr>
+        <w:rPr>
+          <w:rFonts w:hint="eastAsia" w:eastAsia="Malgun Gothic"/>
+          <w:sz w:val="21"/>
+          <w:szCs w:val="21"/>
+          <w:lang w:val="en-US" w:eastAsia="ko-KR"/>
+        </w:rPr>
+      </w:pPr>
+    </w:p>
+    <w:p>
+      <w:pPr>
+        <w:numPr>
+          <w:ilvl w:val="0"/>
           <w:numId w:val="0"/>
         </w:numPr>
         <w:rPr>
@@ -2900,19 +3320,21 @@
     <w:p>
       <w:pPr>
         <w:numPr>
-          <w:numId w:val="0"/>
-        </w:numPr>
-        <w:rPr>
-          <w:rFonts w:hint="eastAsia" w:eastAsia="Malgun Gothic"/>
-          <w:sz w:val="21"/>
-          <w:szCs w:val="21"/>
-          <w:lang w:val="en-US" w:eastAsia="ko-KR"/>
-        </w:rPr>
-      </w:pPr>
-    </w:p>
-    <w:p>
-      <w:pPr>
-        <w:numPr>
+          <w:ilvl w:val="0"/>
+          <w:numId w:val="0"/>
+        </w:numPr>
+        <w:rPr>
+          <w:rFonts w:hint="eastAsia" w:eastAsia="Malgun Gothic"/>
+          <w:sz w:val="21"/>
+          <w:szCs w:val="21"/>
+          <w:lang w:val="en-US" w:eastAsia="ko-KR"/>
+        </w:rPr>
+      </w:pPr>
+    </w:p>
+    <w:p>
+      <w:pPr>
+        <w:numPr>
+          <w:ilvl w:val="0"/>
           <w:numId w:val="0"/>
         </w:numPr>
         <w:rPr>
@@ -3061,19 +3483,21 @@
     <w:p>
       <w:pPr>
         <w:numPr>
-          <w:numId w:val="0"/>
-        </w:numPr>
-        <w:rPr>
-          <w:rFonts w:hint="eastAsia" w:eastAsia="Malgun Gothic"/>
-          <w:sz w:val="21"/>
-          <w:szCs w:val="21"/>
-          <w:lang w:val="en-US" w:eastAsia="ko-KR"/>
-        </w:rPr>
-      </w:pPr>
-    </w:p>
-    <w:p>
-      <w:pPr>
-        <w:numPr>
+          <w:ilvl w:val="0"/>
+          <w:numId w:val="0"/>
+        </w:numPr>
+        <w:rPr>
+          <w:rFonts w:hint="eastAsia" w:eastAsia="Malgun Gothic"/>
+          <w:sz w:val="21"/>
+          <w:szCs w:val="21"/>
+          <w:lang w:val="en-US" w:eastAsia="ko-KR"/>
+        </w:rPr>
+      </w:pPr>
+    </w:p>
+    <w:p>
+      <w:pPr>
+        <w:numPr>
+          <w:ilvl w:val="0"/>
           <w:numId w:val="0"/>
         </w:numPr>
         <w:rPr>
@@ -3096,71 +3520,124 @@
     <w:p>
       <w:pPr>
         <w:numPr>
-          <w:numId w:val="0"/>
-        </w:numPr>
-        <w:rPr>
-          <w:rFonts w:hint="eastAsia" w:eastAsia="Malgun Gothic"/>
-          <w:sz w:val="21"/>
-          <w:szCs w:val="21"/>
-          <w:lang w:val="en-US" w:eastAsia="ko-KR"/>
-        </w:rPr>
-      </w:pPr>
-    </w:p>
-    <w:p>
-      <w:pPr>
-        <w:numPr>
-          <w:numId w:val="0"/>
-        </w:numPr>
-        <w:rPr>
-          <w:rFonts w:hint="eastAsia" w:eastAsia="Malgun Gothic"/>
-          <w:sz w:val="21"/>
-          <w:szCs w:val="21"/>
-          <w:lang w:val="en-US" w:eastAsia="ko-KR"/>
-        </w:rPr>
-      </w:pPr>
-    </w:p>
-    <w:p>
-      <w:pPr>
-        <w:numPr>
-          <w:numId w:val="0"/>
-        </w:numPr>
-        <w:rPr>
-          <w:rFonts w:hint="eastAsia" w:eastAsia="Malgun Gothic"/>
-          <w:sz w:val="21"/>
-          <w:szCs w:val="21"/>
-          <w:lang w:val="en-US" w:eastAsia="ko-KR"/>
-        </w:rPr>
-      </w:pPr>
-    </w:p>
-    <w:p>
-      <w:pPr>
-        <w:numPr>
-          <w:numId w:val="0"/>
-        </w:numPr>
-        <w:rPr>
-          <w:rFonts w:hint="eastAsia" w:eastAsia="Malgun Gothic"/>
-          <w:sz w:val="21"/>
-          <w:szCs w:val="21"/>
-          <w:lang w:val="en-US" w:eastAsia="ko-KR"/>
-        </w:rPr>
-      </w:pPr>
-    </w:p>
-    <w:p>
-      <w:pPr>
-        <w:numPr>
-          <w:numId w:val="0"/>
-        </w:numPr>
-        <w:rPr>
-          <w:rFonts w:hint="eastAsia" w:eastAsia="Malgun Gothic"/>
-          <w:sz w:val="21"/>
-          <w:szCs w:val="21"/>
-          <w:lang w:val="en-US" w:eastAsia="ko-KR"/>
-        </w:rPr>
-      </w:pPr>
-    </w:p>
-    <w:p>
-      <w:pPr>
-        <w:numPr>
+          <w:ilvl w:val="0"/>
+          <w:numId w:val="0"/>
+        </w:numPr>
+        <w:rPr>
+          <w:rFonts w:hint="eastAsia" w:eastAsia="Malgun Gothic"/>
+          <w:sz w:val="21"/>
+          <w:szCs w:val="21"/>
+          <w:lang w:val="en-US" w:eastAsia="ko-KR"/>
+        </w:rPr>
+      </w:pPr>
+    </w:p>
+    <w:p>
+      <w:pPr>
+        <w:numPr>
+          <w:ilvl w:val="0"/>
+          <w:numId w:val="0"/>
+        </w:numPr>
+        <w:rPr>
+          <w:rFonts w:hint="eastAsia" w:eastAsia="Malgun Gothic"/>
+          <w:sz w:val="21"/>
+          <w:szCs w:val="21"/>
+          <w:lang w:val="en-US" w:eastAsia="ko-KR"/>
+        </w:rPr>
+      </w:pPr>
+      <w:r>
+        <w:rPr>
+          <w:rFonts w:hint="eastAsia" w:eastAsia="Malgun Gothic"/>
+          <w:sz w:val="21"/>
+          <w:szCs w:val="21"/>
+          <w:lang w:val="en-US" w:eastAsia="ko-KR"/>
+        </w:rPr>
+        <w:drawing>
+          <wp:inline distT="0" distB="0" distL="114300" distR="114300">
+            <wp:extent cx="5274310" cy="1883410"/>
+            <wp:effectExtent l="0" t="0" r="8890" b="8890"/>
+            <wp:docPr id="9" name="Picture 9" descr="7_MFCCs"/>
+            <wp:cNvGraphicFramePr>
+              <a:graphicFrameLocks xmlns:a="http://schemas.openxmlformats.org/drawingml/2006/main" noChangeAspect="1"/>
+            </wp:cNvGraphicFramePr>
+            <a:graphic xmlns:a="http://schemas.openxmlformats.org/drawingml/2006/main">
+              <a:graphicData uri="http://schemas.openxmlformats.org/drawingml/2006/picture">
+                <pic:pic xmlns:pic="http://schemas.openxmlformats.org/drawingml/2006/picture">
+                  <pic:nvPicPr>
+                    <pic:cNvPr id="9" name="Picture 9" descr="7_MFCCs"/>
+                    <pic:cNvPicPr>
+                      <a:picLocks noChangeAspect="1"/>
+                    </pic:cNvPicPr>
+                  </pic:nvPicPr>
+                  <pic:blipFill>
+                    <a:blip r:embed="rId11"/>
+                    <a:stretch>
+                      <a:fillRect/>
+                    </a:stretch>
+                  </pic:blipFill>
+                  <pic:spPr>
+                    <a:xfrm>
+                      <a:off x="0" y="0"/>
+                      <a:ext cx="5274310" cy="1883410"/>
+                    </a:xfrm>
+                    <a:prstGeom prst="rect">
+                      <a:avLst/>
+                    </a:prstGeom>
+                  </pic:spPr>
+                </pic:pic>
+              </a:graphicData>
+            </a:graphic>
+          </wp:inline>
+        </w:drawing>
+      </w:r>
+      <w:bookmarkStart w:id="0" w:name="_GoBack"/>
+      <w:bookmarkEnd w:id="0"/>
+    </w:p>
+    <w:p>
+      <w:pPr>
+        <w:numPr>
+          <w:ilvl w:val="0"/>
+          <w:numId w:val="0"/>
+        </w:numPr>
+        <w:rPr>
+          <w:rFonts w:hint="eastAsia" w:eastAsia="Malgun Gothic"/>
+          <w:sz w:val="21"/>
+          <w:szCs w:val="21"/>
+          <w:lang w:val="en-US" w:eastAsia="ko-KR"/>
+        </w:rPr>
+      </w:pPr>
+    </w:p>
+    <w:p>
+      <w:pPr>
+        <w:numPr>
+          <w:ilvl w:val="0"/>
+          <w:numId w:val="0"/>
+        </w:numPr>
+        <w:rPr>
+          <w:rFonts w:hint="eastAsia" w:eastAsia="Malgun Gothic"/>
+          <w:sz w:val="21"/>
+          <w:szCs w:val="21"/>
+          <w:lang w:val="en-US" w:eastAsia="ko-KR"/>
+        </w:rPr>
+      </w:pPr>
+    </w:p>
+    <w:p>
+      <w:pPr>
+        <w:numPr>
+          <w:ilvl w:val="0"/>
+          <w:numId w:val="0"/>
+        </w:numPr>
+        <w:rPr>
+          <w:rFonts w:hint="eastAsia" w:eastAsia="Malgun Gothic"/>
+          <w:sz w:val="21"/>
+          <w:szCs w:val="21"/>
+          <w:lang w:val="en-US" w:eastAsia="ko-KR"/>
+        </w:rPr>
+      </w:pPr>
+    </w:p>
+    <w:p>
+      <w:pPr>
+        <w:numPr>
+          <w:ilvl w:val="0"/>
           <w:numId w:val="0"/>
         </w:numPr>
         <w:rPr>
@@ -3183,19 +3660,21 @@
     <w:p>
       <w:pPr>
         <w:numPr>
-          <w:numId w:val="0"/>
-        </w:numPr>
-        <w:rPr>
-          <w:rFonts w:hint="eastAsia" w:eastAsia="Malgun Gothic"/>
-          <w:sz w:val="21"/>
-          <w:szCs w:val="21"/>
-          <w:lang w:val="en-US" w:eastAsia="ko-KR"/>
-        </w:rPr>
-      </w:pPr>
-    </w:p>
-    <w:p>
-      <w:pPr>
-        <w:numPr>
+          <w:ilvl w:val="0"/>
+          <w:numId w:val="0"/>
+        </w:numPr>
+        <w:rPr>
+          <w:rFonts w:hint="eastAsia" w:eastAsia="Malgun Gothic"/>
+          <w:sz w:val="21"/>
+          <w:szCs w:val="21"/>
+          <w:lang w:val="en-US" w:eastAsia="ko-KR"/>
+        </w:rPr>
+      </w:pPr>
+    </w:p>
+    <w:p>
+      <w:pPr>
+        <w:numPr>
+          <w:ilvl w:val="0"/>
           <w:numId w:val="0"/>
         </w:numPr>
         <w:rPr>
@@ -3247,19 +3726,21 @@
     <w:p>
       <w:pPr>
         <w:numPr>
-          <w:numId w:val="0"/>
-        </w:numPr>
-        <w:rPr>
-          <w:rFonts w:hint="default" w:eastAsia="Malgun Gothic"/>
-          <w:sz w:val="21"/>
-          <w:szCs w:val="21"/>
-          <w:lang w:val="en-US" w:eastAsia="ko-KR"/>
-        </w:rPr>
-      </w:pPr>
-    </w:p>
-    <w:p>
-      <w:pPr>
-        <w:numPr>
+          <w:ilvl w:val="0"/>
+          <w:numId w:val="0"/>
+        </w:numPr>
+        <w:rPr>
+          <w:rFonts w:hint="default" w:eastAsia="Malgun Gothic"/>
+          <w:sz w:val="21"/>
+          <w:szCs w:val="21"/>
+          <w:lang w:val="en-US" w:eastAsia="ko-KR"/>
+        </w:rPr>
+      </w:pPr>
+    </w:p>
+    <w:p>
+      <w:pPr>
+        <w:numPr>
+          <w:ilvl w:val="0"/>
           <w:numId w:val="0"/>
         </w:numPr>
         <w:rPr>
@@ -3458,7 +3939,7 @@
     <w:lsdException w:unhideWhenUsed="0" w:uiPriority="0" w:semiHidden="0" w:name="HTML Sample"/>
     <w:lsdException w:unhideWhenUsed="0" w:uiPriority="0" w:semiHidden="0" w:name="HTML Typewriter"/>
     <w:lsdException w:unhideWhenUsed="0" w:uiPriority="0" w:semiHidden="0" w:name="HTML Variable"/>
-    <w:lsdException w:unhideWhenUsed="0" w:uiPriority="0" w:name="Normal Table"/>
+    <w:lsdException w:qFormat="1" w:unhideWhenUsed="0" w:uiPriority="0" w:name="Normal Table"/>
     <w:lsdException w:unhideWhenUsed="0" w:uiPriority="0" w:semiHidden="0" w:name="annotation subject"/>
     <w:lsdException w:unhideWhenUsed="0" w:uiPriority="0" w:semiHidden="0" w:name="Table Simple 1"/>
     <w:lsdException w:unhideWhenUsed="0" w:uiPriority="0" w:semiHidden="0" w:name="Table Simple 2"/>
@@ -3622,6 +4103,7 @@
   <w:style w:type="table" w:default="1" w:styleId="3">
     <w:name w:val="Normal Table"/>
     <w:semiHidden/>
+    <w:qFormat/>
     <w:uiPriority w:val="0"/>
     <w:tblPr>
       <w:tblCellMar>

</xml_diff>

<commit_message>
FEAT : wav transform / dataloader / model baseline
</commit_message>
<xml_diff>
--- a/Week1/Week 1 Task Report.docx
+++ b/Week1/Week 1 Task Report.docx
@@ -563,6 +563,15 @@
           <w:lang w:val="en-US" w:eastAsia="ko-KR"/>
         </w:rPr>
       </w:pPr>
+      <w:r>
+        <w:rPr>
+          <w:rFonts w:hint="eastAsia" w:eastAsia="Malgun Gothic"/>
+          <w:lang w:val="en-US" w:eastAsia="ko-KR"/>
+        </w:rPr>
+        <w:t>인</w:t>
+      </w:r>
+      <w:bookmarkStart w:id="0" w:name="_GoBack"/>
+      <w:bookmarkEnd w:id="0"/>
     </w:p>
     <w:p>
       <w:pPr>
@@ -3708,8 +3717,6 @@
           <w:lang w:val="en-US" w:eastAsia="ko-KR"/>
         </w:rPr>
       </w:pPr>
-      <w:bookmarkStart w:id="0" w:name="_GoBack"/>
-      <w:bookmarkEnd w:id="0"/>
     </w:p>
     <w:p>
       <w:pPr>

</xml_diff>